<commit_message>
Add some files and folders
</commit_message>
<xml_diff>
--- a/1_About_exam/1_about_exam.docx
+++ b/1_About_exam/1_about_exam.docx
@@ -101,7 +101,31 @@
           <w:szCs w:val="28"/>
           <w:lang w:eastAsia="ru-RU"/>
         </w:rPr>
-        <w:t> (в нашем курсе на Python)</w:t>
+        <w:t xml:space="preserve"> (в нашем курсе на </w:t>
+      </w:r>
+      <w:r>
+        <w:rPr>
+          <w:rFonts w:ascii="Times New Roman" w:eastAsia="Times New Roman" w:hAnsi="Times New Roman" w:cs="Times New Roman"/>
+          <w:b/>
+          <w:bCs/>
+          <w:color w:val="222222"/>
+          <w:sz w:val="28"/>
+          <w:szCs w:val="28"/>
+          <w:lang w:eastAsia="ru-RU"/>
+        </w:rPr>
+        <w:t>С++</w:t>
+      </w:r>
+      <w:r>
+        <w:rPr>
+          <w:rFonts w:ascii="Times New Roman" w:eastAsia="Times New Roman" w:hAnsi="Times New Roman" w:cs="Times New Roman"/>
+          <w:b/>
+          <w:bCs/>
+          <w:color w:val="222222"/>
+          <w:sz w:val="28"/>
+          <w:szCs w:val="28"/>
+          <w:lang w:eastAsia="ru-RU"/>
+        </w:rPr>
+        <w:t>)</w:t>
       </w:r>
       <w:r>
         <w:rPr>
@@ -336,7 +360,7 @@
           <w:color w:val="222222"/>
           <w:sz w:val="28"/>
           <w:szCs w:val="28"/>
-          <w:lang w:val="en-US" w:eastAsia="ru-RU"/>
+          <w:lang w:eastAsia="ru-RU"/>
         </w:rPr>
         <w:t xml:space="preserve">1.2 </w:t>
       </w:r>
@@ -512,16 +536,7 @@
           <w:lang w:eastAsia="ru-RU"/>
         </w:rPr>
         <w:tab/>
-      </w:r>
-      <w:r>
-        <w:rPr>
-          <w:rFonts w:ascii="Times New Roman" w:eastAsia="Times New Roman" w:hAnsi="Times New Roman" w:cs="Times New Roman"/>
-          <w:color w:val="222222"/>
-          <w:sz w:val="28"/>
-          <w:szCs w:val="28"/>
-          <w:lang w:eastAsia="ru-RU"/>
-        </w:rPr>
-        <w:tab/>
+        <w:t xml:space="preserve">     </w:t>
       </w:r>
       <w:r>
         <w:rPr>
@@ -4196,7 +4211,7 @@
           <w:szCs w:val="28"/>
           <w:lang w:eastAsia="ru-RU"/>
         </w:rPr>
-        <w:t>Python</w:t>
+        <w:t>С++</w:t>
       </w:r>
       <w:r>
         <w:rPr>
@@ -4444,6 +4459,16 @@
       <w:r>
         <w:rPr>
           <w:rFonts w:ascii="Times New Roman" w:eastAsia="Times New Roman" w:hAnsi="Times New Roman" w:cs="Times New Roman"/>
+          <w:color w:val="222222"/>
+          <w:sz w:val="28"/>
+          <w:szCs w:val="28"/>
+          <w:lang w:eastAsia="ru-RU"/>
+        </w:rPr>
+        <w:t xml:space="preserve">        </w:t>
+      </w:r>
+      <w:r>
+        <w:rPr>
+          <w:rFonts w:ascii="Times New Roman" w:eastAsia="Times New Roman" w:hAnsi="Times New Roman" w:cs="Times New Roman"/>
           <w:b/>
           <w:color w:val="222222"/>
           <w:sz w:val="28"/>
@@ -4455,33 +4480,28 @@
     </w:p>
     <w:p>
       <w:pPr>
-        <w:shd w:val="clear" w:color="auto" w:fill="FFFFFF"/>
-        <w:spacing w:before="240" w:after="240" w:line="240" w:lineRule="auto"/>
-        <w:ind w:firstLine="708"/>
-        <w:rPr>
-          <w:rFonts w:ascii="Times New Roman" w:eastAsia="Times New Roman" w:hAnsi="Times New Roman" w:cs="Times New Roman"/>
-          <w:color w:val="222222"/>
-          <w:sz w:val="28"/>
-          <w:szCs w:val="28"/>
-          <w:lang w:eastAsia="ru-RU"/>
-        </w:rPr>
-      </w:pPr>
-      <w:r>
-        <w:rPr>
-          <w:rFonts w:ascii="Times New Roman" w:eastAsia="Times New Roman" w:hAnsi="Times New Roman" w:cs="Times New Roman"/>
-          <w:color w:val="222222"/>
-          <w:sz w:val="28"/>
-          <w:szCs w:val="28"/>
-          <w:lang w:eastAsia="ru-RU"/>
-        </w:rPr>
-        <w:t>Использование </w:t>
+        <w:spacing w:before="100" w:beforeAutospacing="1" w:after="100" w:afterAutospacing="1" w:line="240" w:lineRule="auto"/>
+        <w:rPr>
+          <w:rFonts w:ascii="Times New Roman" w:eastAsia="Times New Roman" w:hAnsi="Times New Roman" w:cs="Times New Roman"/>
+          <w:sz w:val="28"/>
+          <w:szCs w:val="28"/>
+          <w:lang w:eastAsia="ru-RU"/>
+        </w:rPr>
+      </w:pPr>
+      <w:r>
+        <w:rPr>
+          <w:rFonts w:ascii="Times New Roman" w:eastAsia="Times New Roman" w:hAnsi="Times New Roman" w:cs="Times New Roman"/>
+          <w:sz w:val="28"/>
+          <w:szCs w:val="28"/>
+          <w:lang w:eastAsia="ru-RU"/>
+        </w:rPr>
+        <w:t xml:space="preserve">Использование </w:t>
       </w:r>
       <w:r>
         <w:rPr>
           <w:rFonts w:ascii="Times New Roman" w:eastAsia="Times New Roman" w:hAnsi="Times New Roman" w:cs="Times New Roman"/>
           <w:b/>
           <w:bCs/>
-          <w:color w:val="222222"/>
           <w:sz w:val="28"/>
           <w:szCs w:val="28"/>
           <w:lang w:eastAsia="ru-RU"/>
@@ -4491,19 +4511,17 @@
       <w:r>
         <w:rPr>
           <w:rFonts w:ascii="Times New Roman" w:eastAsia="Times New Roman" w:hAnsi="Times New Roman" w:cs="Times New Roman"/>
-          <w:color w:val="222222"/>
-          <w:sz w:val="28"/>
-          <w:szCs w:val="28"/>
-          <w:lang w:eastAsia="ru-RU"/>
-        </w:rPr>
-        <w:t> при подготовке и сдаче </w:t>
+          <w:sz w:val="28"/>
+          <w:szCs w:val="28"/>
+          <w:lang w:eastAsia="ru-RU"/>
+        </w:rPr>
+        <w:t xml:space="preserve"> при подготовке и сдаче </w:t>
       </w:r>
       <w:r>
         <w:rPr>
           <w:rFonts w:ascii="Times New Roman" w:eastAsia="Times New Roman" w:hAnsi="Times New Roman" w:cs="Times New Roman"/>
           <w:b/>
           <w:bCs/>
-          <w:color w:val="222222"/>
           <w:sz w:val="28"/>
           <w:szCs w:val="28"/>
           <w:lang w:eastAsia="ru-RU"/>
@@ -4513,19 +4531,17 @@
       <w:r>
         <w:rPr>
           <w:rFonts w:ascii="Times New Roman" w:eastAsia="Times New Roman" w:hAnsi="Times New Roman" w:cs="Times New Roman"/>
-          <w:color w:val="222222"/>
-          <w:sz w:val="28"/>
-          <w:szCs w:val="28"/>
-          <w:lang w:eastAsia="ru-RU"/>
-        </w:rPr>
-        <w:t> по информатике также имеет свои сильные стороны. Этот язык программирования широко используется в профессиональной среде и позволяет глубже понять структуру алгоритмов и работу с памятью. Ниже представлены ключевые аргументы в пользу выбора </w:t>
+          <w:sz w:val="28"/>
+          <w:szCs w:val="28"/>
+          <w:lang w:eastAsia="ru-RU"/>
+        </w:rPr>
+        <w:t xml:space="preserve"> по информатике также имеет свои сильные стороны. Этот язык программирования широко используется в профессиональной среде и позволяет глубже понять структуру алгоритмов и работу с памятью. Ниже представлены ключевые аргументы в пользу выбора </w:t>
       </w:r>
       <w:r>
         <w:rPr>
           <w:rFonts w:ascii="Times New Roman" w:eastAsia="Times New Roman" w:hAnsi="Times New Roman" w:cs="Times New Roman"/>
           <w:b/>
           <w:bCs/>
-          <w:color w:val="222222"/>
           <w:sz w:val="28"/>
           <w:szCs w:val="28"/>
           <w:lang w:eastAsia="ru-RU"/>
@@ -4535,7 +4551,6 @@
       <w:r>
         <w:rPr>
           <w:rFonts w:ascii="Times New Roman" w:eastAsia="Times New Roman" w:hAnsi="Times New Roman" w:cs="Times New Roman"/>
-          <w:color w:val="222222"/>
           <w:sz w:val="28"/>
           <w:szCs w:val="28"/>
           <w:lang w:eastAsia="ru-RU"/>
@@ -4545,26 +4560,10 @@
     </w:p>
     <w:p>
       <w:pPr>
-        <w:shd w:val="clear" w:color="auto" w:fill="FFFFFF"/>
-        <w:spacing w:before="240" w:after="240" w:line="240" w:lineRule="auto"/>
-        <w:ind w:firstLine="708"/>
-        <w:rPr>
-          <w:rFonts w:ascii="Times New Roman" w:eastAsia="Times New Roman" w:hAnsi="Times New Roman" w:cs="Times New Roman"/>
-          <w:color w:val="222222"/>
-          <w:sz w:val="28"/>
-          <w:szCs w:val="28"/>
-          <w:lang w:eastAsia="ru-RU"/>
-        </w:rPr>
-      </w:pPr>
-    </w:p>
-    <w:p>
-      <w:pPr>
-        <w:shd w:val="clear" w:color="auto" w:fill="FFFFFF"/>
-        <w:spacing w:before="240" w:after="240" w:line="240" w:lineRule="auto"/>
-        <w:ind w:left="2124" w:firstLine="708"/>
-        <w:rPr>
-          <w:rFonts w:ascii="Times New Roman" w:eastAsia="Times New Roman" w:hAnsi="Times New Roman" w:cs="Times New Roman"/>
-          <w:color w:val="222222"/>
+        <w:spacing w:before="100" w:beforeAutospacing="1" w:after="100" w:afterAutospacing="1" w:line="240" w:lineRule="auto"/>
+        <w:jc w:val="center"/>
+        <w:rPr>
+          <w:rFonts w:ascii="Times New Roman" w:eastAsia="Times New Roman" w:hAnsi="Times New Roman" w:cs="Times New Roman"/>
           <w:sz w:val="28"/>
           <w:szCs w:val="28"/>
           <w:lang w:eastAsia="ru-RU"/>
@@ -4575,7 +4574,6 @@
           <w:rFonts w:ascii="Times New Roman" w:eastAsia="Times New Roman" w:hAnsi="Times New Roman" w:cs="Times New Roman"/>
           <w:b/>
           <w:bCs/>
-          <w:color w:val="222222"/>
           <w:sz w:val="28"/>
           <w:szCs w:val="28"/>
           <w:lang w:eastAsia="ru-RU"/>
@@ -4585,21 +4583,17 @@
     </w:p>
     <w:p>
       <w:pPr>
-        <w:shd w:val="clear" w:color="auto" w:fill="FFFFFF"/>
-        <w:spacing w:before="240" w:after="240" w:line="240" w:lineRule="auto"/>
-        <w:ind w:firstLine="708"/>
-        <w:rPr>
-          <w:rFonts w:ascii="Times New Roman" w:eastAsia="Times New Roman" w:hAnsi="Times New Roman" w:cs="Times New Roman"/>
-          <w:color w:val="222222"/>
-          <w:sz w:val="28"/>
-          <w:szCs w:val="28"/>
-          <w:lang w:eastAsia="ru-RU"/>
-        </w:rPr>
-      </w:pPr>
-      <w:r>
-        <w:rPr>
-          <w:rFonts w:ascii="Times New Roman" w:eastAsia="Times New Roman" w:hAnsi="Times New Roman" w:cs="Times New Roman"/>
-          <w:color w:val="222222"/>
+        <w:spacing w:before="100" w:beforeAutospacing="1" w:after="100" w:afterAutospacing="1" w:line="240" w:lineRule="auto"/>
+        <w:rPr>
+          <w:rFonts w:ascii="Times New Roman" w:eastAsia="Times New Roman" w:hAnsi="Times New Roman" w:cs="Times New Roman"/>
+          <w:sz w:val="28"/>
+          <w:szCs w:val="28"/>
+          <w:lang w:eastAsia="ru-RU"/>
+        </w:rPr>
+      </w:pPr>
+      <w:r>
+        <w:rPr>
+          <w:rFonts w:ascii="Times New Roman" w:eastAsia="Times New Roman" w:hAnsi="Times New Roman" w:cs="Times New Roman"/>
           <w:sz w:val="28"/>
           <w:szCs w:val="28"/>
           <w:lang w:eastAsia="ru-RU"/>
@@ -4609,12 +4603,9 @@
     </w:p>
     <w:p>
       <w:pPr>
-        <w:shd w:val="clear" w:color="auto" w:fill="FFFFFF"/>
-        <w:spacing w:before="240" w:after="240" w:line="240" w:lineRule="auto"/>
-        <w:ind w:firstLine="708"/>
-        <w:rPr>
-          <w:rFonts w:ascii="Times New Roman" w:eastAsia="Times New Roman" w:hAnsi="Times New Roman" w:cs="Times New Roman"/>
-          <w:color w:val="222222"/>
+        <w:spacing w:before="100" w:beforeAutospacing="1" w:after="100" w:afterAutospacing="1" w:line="240" w:lineRule="auto"/>
+        <w:rPr>
+          <w:rFonts w:ascii="Times New Roman" w:eastAsia="Times New Roman" w:hAnsi="Times New Roman" w:cs="Times New Roman"/>
           <w:sz w:val="28"/>
           <w:szCs w:val="28"/>
           <w:lang w:eastAsia="ru-RU"/>
@@ -4625,7 +4616,6 @@
           <w:rFonts w:ascii="Times New Roman" w:eastAsia="Times New Roman" w:hAnsi="Times New Roman" w:cs="Times New Roman"/>
           <w:b/>
           <w:bCs/>
-          <w:color w:val="222222"/>
           <w:sz w:val="28"/>
           <w:szCs w:val="28"/>
           <w:lang w:eastAsia="ru-RU"/>
@@ -4635,96 +4625,81 @@
       <w:r>
         <w:rPr>
           <w:rFonts w:ascii="Times New Roman" w:eastAsia="Times New Roman" w:hAnsi="Times New Roman" w:cs="Times New Roman"/>
-          <w:color w:val="222222"/>
-          <w:sz w:val="28"/>
-          <w:szCs w:val="28"/>
-          <w:lang w:eastAsia="ru-RU"/>
-        </w:rPr>
-        <w:t> требует от учащегося чёткого понимания типов данных, структуры программы и логики выполнения. Это способствует более осознанному и глубокому изучению информатики. Например, цикл от 1 до 10 на C++ выглядит так:</w:t>
-      </w:r>
-    </w:p>
-    <w:p>
-      <w:pPr>
-        <w:shd w:val="clear" w:color="auto" w:fill="FFFFFF"/>
-        <w:spacing w:before="240" w:after="240" w:line="240" w:lineRule="auto"/>
-        <w:rPr>
-          <w:rFonts w:ascii="Times New Roman" w:eastAsia="Times New Roman" w:hAnsi="Times New Roman" w:cs="Times New Roman"/>
-          <w:color w:val="222222"/>
-          <w:sz w:val="28"/>
-          <w:szCs w:val="28"/>
-          <w:lang w:eastAsia="ru-RU"/>
-        </w:rPr>
-      </w:pPr>
-      <w:r>
-        <w:rPr>
-          <w:rFonts w:eastAsia="Times New Roman" w:cstheme="minorHAnsi"/>
-          <w:color w:val="006666"/>
-          <w:sz w:val="28"/>
-          <w:szCs w:val="28"/>
-          <w:shd w:val="clear" w:color="auto" w:fill="F3F4F6"/>
-          <w:lang w:eastAsia="ru-RU"/>
-        </w:rPr>
-        <w:t>#</w:t>
-      </w:r>
-      <w:r>
-        <w:rPr>
-          <w:rFonts w:eastAsia="Times New Roman" w:cstheme="minorHAnsi"/>
-          <w:color w:val="000088"/>
-          <w:sz w:val="28"/>
-          <w:szCs w:val="28"/>
-          <w:shd w:val="clear" w:color="auto" w:fill="F3F4F6"/>
+          <w:sz w:val="28"/>
+          <w:szCs w:val="28"/>
+          <w:lang w:eastAsia="ru-RU"/>
+        </w:rPr>
+        <w:t xml:space="preserve"> требует от учащегося чёткого понимания типов данных, структуры программы и логики выполнения. Это способствует более осознанному и глубокому изучению информатики. Например, цикл от 1 до 10 на C++ выглядит так:</w:t>
+      </w:r>
+    </w:p>
+    <w:p>
+      <w:pPr>
+        <w:spacing w:before="100" w:beforeAutospacing="1" w:after="100" w:afterAutospacing="1" w:line="240" w:lineRule="auto"/>
+        <w:rPr>
+          <w:rFonts w:ascii="Times New Roman" w:eastAsia="Times New Roman" w:hAnsi="Times New Roman" w:cs="Times New Roman"/>
+          <w:sz w:val="28"/>
+          <w:szCs w:val="28"/>
           <w:lang w:val="en-US" w:eastAsia="ru-RU"/>
         </w:rPr>
-        <w:t>include</w:t>
-      </w:r>
-      <w:r>
-        <w:rPr>
-          <w:rFonts w:eastAsia="Times New Roman" w:cstheme="minorHAnsi"/>
-          <w:color w:val="006666"/>
-          <w:sz w:val="28"/>
-          <w:szCs w:val="28"/>
-          <w:shd w:val="clear" w:color="auto" w:fill="F3F4F6"/>
-          <w:lang w:eastAsia="ru-RU"/>
+      </w:pPr>
+      <w:r>
+        <w:rPr>
+          <w:rFonts w:ascii="Times New Roman" w:eastAsia="Times New Roman" w:hAnsi="Times New Roman" w:cs="Times New Roman"/>
+          <w:b/>
+          <w:bCs/>
+          <w:sz w:val="28"/>
+          <w:szCs w:val="28"/>
+          <w:lang w:eastAsia="ru-RU"/>
+        </w:rPr>
+        <w:t>Листинг</w:t>
+      </w:r>
+      <w:r>
+        <w:rPr>
+          <w:rFonts w:ascii="Times New Roman" w:eastAsia="Times New Roman" w:hAnsi="Times New Roman" w:cs="Times New Roman"/>
+          <w:b/>
+          <w:bCs/>
+          <w:sz w:val="28"/>
+          <w:szCs w:val="28"/>
+          <w:lang w:val="en-US" w:eastAsia="ru-RU"/>
+        </w:rPr>
+        <w:t xml:space="preserve"> 1. </w:t>
+      </w:r>
+      <w:r>
+        <w:rPr>
+          <w:rFonts w:ascii="Times New Roman" w:eastAsia="Times New Roman" w:hAnsi="Times New Roman" w:cs="Times New Roman"/>
+          <w:b/>
+          <w:bCs/>
+          <w:sz w:val="28"/>
+          <w:szCs w:val="28"/>
+          <w:lang w:eastAsia="ru-RU"/>
+        </w:rPr>
+        <w:t>Пример</w:t>
+      </w:r>
+      <w:r>
+        <w:rPr>
+          <w:rFonts w:ascii="Times New Roman" w:eastAsia="Times New Roman" w:hAnsi="Times New Roman" w:cs="Times New Roman"/>
+          <w:b/>
+          <w:bCs/>
+          <w:sz w:val="28"/>
+          <w:szCs w:val="28"/>
+          <w:lang w:val="en-US" w:eastAsia="ru-RU"/>
         </w:rPr>
         <w:t xml:space="preserve"> </w:t>
       </w:r>
       <w:r>
         <w:rPr>
-          <w:rFonts w:eastAsia="Times New Roman" w:cstheme="minorHAnsi"/>
-          <w:color w:val="008800"/>
-          <w:sz w:val="28"/>
-          <w:szCs w:val="28"/>
-          <w:shd w:val="clear" w:color="auto" w:fill="F3F4F6"/>
-          <w:lang w:eastAsia="ru-RU"/>
-        </w:rPr>
-        <w:t>&lt;</w:t>
-      </w:r>
-      <w:r>
-        <w:rPr>
-          <w:rFonts w:eastAsia="Times New Roman" w:cstheme="minorHAnsi"/>
-          <w:color w:val="008800"/>
-          <w:sz w:val="28"/>
-          <w:szCs w:val="28"/>
-          <w:shd w:val="clear" w:color="auto" w:fill="F3F4F6"/>
-          <w:lang w:val="en-US" w:eastAsia="ru-RU"/>
-        </w:rPr>
-        <w:t>iostream</w:t>
-      </w:r>
-      <w:r>
-        <w:rPr>
-          <w:rFonts w:eastAsia="Times New Roman" w:cstheme="minorHAnsi"/>
-          <w:color w:val="008800"/>
-          <w:sz w:val="28"/>
-          <w:szCs w:val="28"/>
-          <w:shd w:val="clear" w:color="auto" w:fill="F3F4F6"/>
-          <w:lang w:eastAsia="ru-RU"/>
-        </w:rPr>
-        <w:t>&gt;</w:t>
-      </w:r>
-    </w:p>
-    <w:p>
-      <w:pPr>
-        <w:shd w:val="clear" w:color="auto" w:fill="FFFFFF"/>
+          <w:rFonts w:ascii="Times New Roman" w:eastAsia="Times New Roman" w:hAnsi="Times New Roman" w:cs="Times New Roman"/>
+          <w:b/>
+          <w:bCs/>
+          <w:sz w:val="28"/>
+          <w:szCs w:val="28"/>
+          <w:lang w:eastAsia="ru-RU"/>
+        </w:rPr>
+        <w:t>цикла</w:t>
+      </w:r>
+    </w:p>
+    <w:p>
+      <w:pPr>
         <w:tabs>
           <w:tab w:val="left" w:pos="916"/>
           <w:tab w:val="left" w:pos="1832"/>
@@ -4743,86 +4718,26 @@
           <w:tab w:val="left" w:pos="13740"/>
           <w:tab w:val="left" w:pos="14656"/>
         </w:tabs>
-        <w:spacing w:before="240" w:after="240" w:line="312" w:lineRule="atLeast"/>
-        <w:rPr>
-          <w:rFonts w:eastAsia="Times New Roman" w:cstheme="minorHAnsi"/>
-          <w:color w:val="000000"/>
-          <w:sz w:val="28"/>
-          <w:szCs w:val="28"/>
-          <w:shd w:val="clear" w:color="auto" w:fill="F3F4F6"/>
-          <w:lang w:eastAsia="ru-RU"/>
-        </w:rPr>
-      </w:pPr>
-      <w:r>
-        <w:rPr>
-          <w:rFonts w:eastAsia="Times New Roman" w:cstheme="minorHAnsi"/>
-          <w:color w:val="000088"/>
-          <w:sz w:val="28"/>
-          <w:szCs w:val="28"/>
-          <w:shd w:val="clear" w:color="auto" w:fill="F3F4F6"/>
+        <w:spacing w:after="0" w:line="240" w:lineRule="auto"/>
+        <w:rPr>
+          <w:rFonts w:ascii="Times New Roman" w:eastAsia="Times New Roman" w:hAnsi="Times New Roman" w:cs="Times New Roman"/>
+          <w:sz w:val="28"/>
+          <w:szCs w:val="28"/>
           <w:lang w:val="en-US" w:eastAsia="ru-RU"/>
         </w:rPr>
-        <w:t>using</w:t>
-      </w:r>
-      <w:r>
-        <w:rPr>
-          <w:rFonts w:eastAsia="Times New Roman" w:cstheme="minorHAnsi"/>
-          <w:color w:val="000000"/>
-          <w:sz w:val="28"/>
-          <w:szCs w:val="28"/>
-          <w:shd w:val="clear" w:color="auto" w:fill="F3F4F6"/>
-          <w:lang w:eastAsia="ru-RU"/>
-        </w:rPr>
-        <w:t xml:space="preserve"> </w:t>
-      </w:r>
-      <w:r>
-        <w:rPr>
-          <w:rFonts w:eastAsia="Times New Roman" w:cstheme="minorHAnsi"/>
-          <w:color w:val="000088"/>
-          <w:sz w:val="28"/>
-          <w:szCs w:val="28"/>
-          <w:shd w:val="clear" w:color="auto" w:fill="F3F4F6"/>
+      </w:pPr>
+      <w:r>
+        <w:rPr>
+          <w:rFonts w:ascii="Times New Roman" w:eastAsia="Times New Roman" w:hAnsi="Times New Roman" w:cs="Times New Roman"/>
+          <w:sz w:val="28"/>
+          <w:szCs w:val="28"/>
           <w:lang w:val="en-US" w:eastAsia="ru-RU"/>
         </w:rPr>
-        <w:t>namespace</w:t>
-      </w:r>
-      <w:r>
-        <w:rPr>
-          <w:rFonts w:eastAsia="Times New Roman" w:cstheme="minorHAnsi"/>
-          <w:color w:val="000000"/>
-          <w:sz w:val="28"/>
-          <w:szCs w:val="28"/>
-          <w:shd w:val="clear" w:color="auto" w:fill="F3F4F6"/>
-          <w:lang w:eastAsia="ru-RU"/>
-        </w:rPr>
-        <w:t xml:space="preserve"> </w:t>
-      </w:r>
-      <w:r>
-        <w:rPr>
-          <w:rFonts w:eastAsia="Times New Roman" w:cstheme="minorHAnsi"/>
-          <w:color w:val="000000"/>
-          <w:sz w:val="28"/>
-          <w:szCs w:val="28"/>
-          <w:shd w:val="clear" w:color="auto" w:fill="F3F4F6"/>
-          <w:lang w:val="en-US" w:eastAsia="ru-RU"/>
-        </w:rPr>
-        <w:t>std</w:t>
-      </w:r>
-      <w:r>
-        <w:rPr>
-          <w:rFonts w:eastAsia="Times New Roman" w:cstheme="minorHAnsi"/>
-          <w:color w:val="000000"/>
-          <w:sz w:val="28"/>
-          <w:szCs w:val="28"/>
-          <w:shd w:val="clear" w:color="auto" w:fill="F3F4F6"/>
-          <w:lang w:eastAsia="ru-RU"/>
-        </w:rPr>
-        <w:t>;</w:t>
-      </w:r>
-    </w:p>
-    <w:p>
-      <w:pPr>
-        <w:shd w:val="clear" w:color="auto" w:fill="FFFFFF"/>
+        <w:t>#include &lt;iostream&gt;</w:t>
+      </w:r>
+    </w:p>
+    <w:p>
+      <w:pPr>
         <w:tabs>
           <w:tab w:val="left" w:pos="916"/>
           <w:tab w:val="left" w:pos="1832"/>
@@ -4841,64 +4756,26 @@
           <w:tab w:val="left" w:pos="13740"/>
           <w:tab w:val="left" w:pos="14656"/>
         </w:tabs>
-        <w:spacing w:before="240" w:after="240" w:line="312" w:lineRule="atLeast"/>
-        <w:rPr>
-          <w:rFonts w:eastAsia="Times New Roman" w:cstheme="minorHAnsi"/>
-          <w:color w:val="000000"/>
-          <w:sz w:val="28"/>
-          <w:szCs w:val="28"/>
-          <w:shd w:val="clear" w:color="auto" w:fill="F3F4F6"/>
+        <w:spacing w:after="0" w:line="240" w:lineRule="auto"/>
+        <w:rPr>
+          <w:rFonts w:ascii="Times New Roman" w:eastAsia="Times New Roman" w:hAnsi="Times New Roman" w:cs="Times New Roman"/>
+          <w:sz w:val="28"/>
+          <w:szCs w:val="28"/>
           <w:lang w:val="en-US" w:eastAsia="ru-RU"/>
         </w:rPr>
       </w:pPr>
       <w:r>
         <w:rPr>
-          <w:rFonts w:eastAsia="Times New Roman" w:cstheme="minorHAnsi"/>
-          <w:color w:val="660066"/>
-          <w:sz w:val="28"/>
-          <w:szCs w:val="28"/>
-          <w:shd w:val="clear" w:color="auto" w:fill="F3F4F6"/>
+          <w:rFonts w:ascii="Times New Roman" w:eastAsia="Times New Roman" w:hAnsi="Times New Roman" w:cs="Times New Roman"/>
+          <w:sz w:val="28"/>
+          <w:szCs w:val="28"/>
           <w:lang w:val="en-US" w:eastAsia="ru-RU"/>
         </w:rPr>
-        <w:t>int</w:t>
-      </w:r>
-      <w:r>
-        <w:rPr>
-          <w:rFonts w:eastAsia="Times New Roman" w:cstheme="minorHAnsi"/>
-          <w:color w:val="000000"/>
-          <w:sz w:val="28"/>
-          <w:szCs w:val="28"/>
-          <w:shd w:val="clear" w:color="auto" w:fill="F3F4F6"/>
-          <w:lang w:val="en-US" w:eastAsia="ru-RU"/>
-        </w:rPr>
-        <w:t xml:space="preserve"> </w:t>
-      </w:r>
-      <w:r>
-        <w:rPr>
-          <w:rFonts w:eastAsia="Times New Roman" w:cstheme="minorHAnsi"/>
-          <w:color w:val="660066"/>
-          <w:sz w:val="28"/>
-          <w:szCs w:val="28"/>
-          <w:shd w:val="clear" w:color="auto" w:fill="F3F4F6"/>
-          <w:lang w:val="en-US" w:eastAsia="ru-RU"/>
-        </w:rPr>
-        <w:t>main()</w:t>
-      </w:r>
-      <w:r>
-        <w:rPr>
-          <w:rFonts w:eastAsia="Times New Roman" w:cstheme="minorHAnsi"/>
-          <w:color w:val="000000"/>
-          <w:sz w:val="28"/>
-          <w:szCs w:val="28"/>
-          <w:shd w:val="clear" w:color="auto" w:fill="F3F4F6"/>
-          <w:lang w:val="en-US" w:eastAsia="ru-RU"/>
-        </w:rPr>
-        <w:t xml:space="preserve"> {</w:t>
-      </w:r>
-    </w:p>
-    <w:p>
-      <w:pPr>
-        <w:shd w:val="clear" w:color="auto" w:fill="FFFFFF"/>
+        <w:t>using namespace std;</w:t>
+      </w:r>
+    </w:p>
+    <w:p>
+      <w:pPr>
         <w:tabs>
           <w:tab w:val="left" w:pos="916"/>
           <w:tab w:val="left" w:pos="1832"/>
@@ -4917,119 +4794,17 @@
           <w:tab w:val="left" w:pos="13740"/>
           <w:tab w:val="left" w:pos="14656"/>
         </w:tabs>
-        <w:spacing w:before="240" w:after="240" w:line="312" w:lineRule="atLeast"/>
-        <w:rPr>
-          <w:rFonts w:eastAsia="Times New Roman" w:cstheme="minorHAnsi"/>
-          <w:color w:val="000000"/>
-          <w:sz w:val="28"/>
-          <w:szCs w:val="28"/>
-          <w:shd w:val="clear" w:color="auto" w:fill="F3F4F6"/>
+        <w:spacing w:after="0" w:line="240" w:lineRule="auto"/>
+        <w:rPr>
+          <w:rFonts w:ascii="Times New Roman" w:eastAsia="Times New Roman" w:hAnsi="Times New Roman" w:cs="Times New Roman"/>
+          <w:sz w:val="28"/>
+          <w:szCs w:val="28"/>
           <w:lang w:val="en-US" w:eastAsia="ru-RU"/>
         </w:rPr>
       </w:pPr>
-      <w:r>
-        <w:rPr>
-          <w:rFonts w:eastAsia="Times New Roman" w:cstheme="minorHAnsi"/>
-          <w:color w:val="000000"/>
-          <w:sz w:val="28"/>
-          <w:szCs w:val="28"/>
-          <w:shd w:val="clear" w:color="auto" w:fill="F3F4F6"/>
-          <w:lang w:val="en-US" w:eastAsia="ru-RU"/>
-        </w:rPr>
-        <w:t xml:space="preserve">    </w:t>
-      </w:r>
-      <w:r>
-        <w:rPr>
-          <w:rFonts w:eastAsia="Times New Roman" w:cstheme="minorHAnsi"/>
-          <w:color w:val="000088"/>
-          <w:sz w:val="28"/>
-          <w:szCs w:val="28"/>
-          <w:shd w:val="clear" w:color="auto" w:fill="F3F4F6"/>
-          <w:lang w:val="en-US" w:eastAsia="ru-RU"/>
-        </w:rPr>
-        <w:t>for</w:t>
-      </w:r>
-      <w:r>
-        <w:rPr>
-          <w:rFonts w:eastAsia="Times New Roman" w:cstheme="minorHAnsi"/>
-          <w:color w:val="000000"/>
-          <w:sz w:val="28"/>
-          <w:szCs w:val="28"/>
-          <w:shd w:val="clear" w:color="auto" w:fill="F3F4F6"/>
-          <w:lang w:val="en-US" w:eastAsia="ru-RU"/>
-        </w:rPr>
-        <w:t xml:space="preserve"> (</w:t>
-      </w:r>
-      <w:r>
-        <w:rPr>
-          <w:rFonts w:eastAsia="Times New Roman" w:cstheme="minorHAnsi"/>
-          <w:color w:val="660066"/>
-          <w:sz w:val="28"/>
-          <w:szCs w:val="28"/>
-          <w:shd w:val="clear" w:color="auto" w:fill="F3F4F6"/>
-          <w:lang w:val="en-US" w:eastAsia="ru-RU"/>
-        </w:rPr>
-        <w:t>int</w:t>
-      </w:r>
-      <w:r>
-        <w:rPr>
-          <w:rFonts w:eastAsia="Times New Roman" w:cstheme="minorHAnsi"/>
-          <w:color w:val="000000"/>
-          <w:sz w:val="28"/>
-          <w:szCs w:val="28"/>
-          <w:shd w:val="clear" w:color="auto" w:fill="F3F4F6"/>
-          <w:lang w:val="en-US" w:eastAsia="ru-RU"/>
-        </w:rPr>
-        <w:t xml:space="preserve"> i = </w:t>
-      </w:r>
-      <w:r>
-        <w:rPr>
-          <w:rFonts w:eastAsia="Times New Roman" w:cstheme="minorHAnsi"/>
-          <w:color w:val="006666"/>
-          <w:sz w:val="28"/>
-          <w:szCs w:val="28"/>
-          <w:shd w:val="clear" w:color="auto" w:fill="F3F4F6"/>
-          <w:lang w:val="en-US" w:eastAsia="ru-RU"/>
-        </w:rPr>
-        <w:t>1</w:t>
-      </w:r>
-      <w:r>
-        <w:rPr>
-          <w:rFonts w:eastAsia="Times New Roman" w:cstheme="minorHAnsi"/>
-          <w:color w:val="000000"/>
-          <w:sz w:val="28"/>
-          <w:szCs w:val="28"/>
-          <w:shd w:val="clear" w:color="auto" w:fill="F3F4F6"/>
-          <w:lang w:val="en-US" w:eastAsia="ru-RU"/>
-        </w:rPr>
-        <w:t xml:space="preserve">; i &lt;= </w:t>
-      </w:r>
-      <w:r>
-        <w:rPr>
-          <w:rFonts w:eastAsia="Times New Roman" w:cstheme="minorHAnsi"/>
-          <w:color w:val="006666"/>
-          <w:sz w:val="28"/>
-          <w:szCs w:val="28"/>
-          <w:shd w:val="clear" w:color="auto" w:fill="F3F4F6"/>
-          <w:lang w:val="en-US" w:eastAsia="ru-RU"/>
-        </w:rPr>
-        <w:t>10</w:t>
-      </w:r>
-      <w:r>
-        <w:rPr>
-          <w:rFonts w:eastAsia="Times New Roman" w:cstheme="minorHAnsi"/>
-          <w:color w:val="000000"/>
-          <w:sz w:val="28"/>
-          <w:szCs w:val="28"/>
-          <w:shd w:val="clear" w:color="auto" w:fill="F3F4F6"/>
-          <w:lang w:val="en-US" w:eastAsia="ru-RU"/>
-        </w:rPr>
-        <w:t>; i++) {</w:t>
-      </w:r>
-    </w:p>
-    <w:p>
-      <w:pPr>
-        <w:shd w:val="clear" w:color="auto" w:fill="FFFFFF"/>
+    </w:p>
+    <w:p>
+      <w:pPr>
         <w:tabs>
           <w:tab w:val="left" w:pos="916"/>
           <w:tab w:val="left" w:pos="1832"/>
@@ -5048,42 +4823,26 @@
           <w:tab w:val="left" w:pos="13740"/>
           <w:tab w:val="left" w:pos="14656"/>
         </w:tabs>
-        <w:spacing w:before="240" w:after="240" w:line="312" w:lineRule="atLeast"/>
-        <w:rPr>
-          <w:rFonts w:eastAsia="Times New Roman" w:cstheme="minorHAnsi"/>
-          <w:color w:val="000000"/>
-          <w:sz w:val="28"/>
-          <w:szCs w:val="28"/>
-          <w:shd w:val="clear" w:color="auto" w:fill="F3F4F6"/>
-          <w:lang w:eastAsia="ru-RU"/>
-        </w:rPr>
-      </w:pPr>
-      <w:r>
-        <w:rPr>
-          <w:rFonts w:eastAsia="Times New Roman" w:cstheme="minorHAnsi"/>
-          <w:color w:val="000000"/>
-          <w:sz w:val="28"/>
-          <w:szCs w:val="28"/>
-          <w:shd w:val="clear" w:color="auto" w:fill="F3F4F6"/>
+        <w:spacing w:after="0" w:line="240" w:lineRule="auto"/>
+        <w:rPr>
+          <w:rFonts w:ascii="Times New Roman" w:eastAsia="Times New Roman" w:hAnsi="Times New Roman" w:cs="Times New Roman"/>
+          <w:sz w:val="28"/>
+          <w:szCs w:val="28"/>
           <w:lang w:val="en-US" w:eastAsia="ru-RU"/>
         </w:rPr>
-        <w:t xml:space="preserve">        </w:t>
-      </w:r>
-      <w:r>
-        <w:rPr>
-          <w:rFonts w:eastAsia="Times New Roman" w:cstheme="minorHAnsi"/>
-          <w:color w:val="000000"/>
-          <w:sz w:val="28"/>
-          <w:szCs w:val="28"/>
-          <w:shd w:val="clear" w:color="auto" w:fill="F3F4F6"/>
-          <w:lang w:eastAsia="ru-RU"/>
-        </w:rPr>
-        <w:t>cout &lt;&lt; i &lt;&lt; endl;</w:t>
-      </w:r>
-    </w:p>
-    <w:p>
-      <w:pPr>
-        <w:shd w:val="clear" w:color="auto" w:fill="FFFFFF"/>
+      </w:pPr>
+      <w:r>
+        <w:rPr>
+          <w:rFonts w:ascii="Times New Roman" w:eastAsia="Times New Roman" w:hAnsi="Times New Roman" w:cs="Times New Roman"/>
+          <w:sz w:val="28"/>
+          <w:szCs w:val="28"/>
+          <w:lang w:val="en-US" w:eastAsia="ru-RU"/>
+        </w:rPr>
+        <w:t>int main() {</w:t>
+      </w:r>
+    </w:p>
+    <w:p>
+      <w:pPr>
         <w:tabs>
           <w:tab w:val="left" w:pos="916"/>
           <w:tab w:val="left" w:pos="1832"/>
@@ -5102,31 +4861,26 @@
           <w:tab w:val="left" w:pos="13740"/>
           <w:tab w:val="left" w:pos="14656"/>
         </w:tabs>
-        <w:spacing w:before="240" w:after="240" w:line="312" w:lineRule="atLeast"/>
-        <w:rPr>
-          <w:rFonts w:eastAsia="Times New Roman" w:cstheme="minorHAnsi"/>
-          <w:color w:val="000000"/>
-          <w:sz w:val="28"/>
-          <w:szCs w:val="28"/>
-          <w:shd w:val="clear" w:color="auto" w:fill="F3F4F6"/>
-          <w:lang w:eastAsia="ru-RU"/>
-        </w:rPr>
-      </w:pPr>
-      <w:r>
-        <w:rPr>
-          <w:rFonts w:eastAsia="Times New Roman" w:cstheme="minorHAnsi"/>
-          <w:color w:val="000000"/>
-          <w:sz w:val="28"/>
-          <w:szCs w:val="28"/>
-          <w:shd w:val="clear" w:color="auto" w:fill="F3F4F6"/>
-          <w:lang w:eastAsia="ru-RU"/>
-        </w:rPr>
-        <w:t>    }</w:t>
-      </w:r>
-    </w:p>
-    <w:p>
-      <w:pPr>
-        <w:shd w:val="clear" w:color="auto" w:fill="FFFFFF"/>
+        <w:spacing w:after="0" w:line="240" w:lineRule="auto"/>
+        <w:rPr>
+          <w:rFonts w:ascii="Times New Roman" w:eastAsia="Times New Roman" w:hAnsi="Times New Roman" w:cs="Times New Roman"/>
+          <w:sz w:val="28"/>
+          <w:szCs w:val="28"/>
+          <w:lang w:val="en-US" w:eastAsia="ru-RU"/>
+        </w:rPr>
+      </w:pPr>
+      <w:r>
+        <w:rPr>
+          <w:rFonts w:ascii="Times New Roman" w:eastAsia="Times New Roman" w:hAnsi="Times New Roman" w:cs="Times New Roman"/>
+          <w:sz w:val="28"/>
+          <w:szCs w:val="28"/>
+          <w:lang w:val="en-US" w:eastAsia="ru-RU"/>
+        </w:rPr>
+        <w:t>    for (int i = 1; i &lt;= 10; i++) {</w:t>
+      </w:r>
+    </w:p>
+    <w:p>
+      <w:pPr>
         <w:tabs>
           <w:tab w:val="left" w:pos="916"/>
           <w:tab w:val="left" w:pos="1832"/>
@@ -5145,75 +4899,35 @@
           <w:tab w:val="left" w:pos="13740"/>
           <w:tab w:val="left" w:pos="14656"/>
         </w:tabs>
-        <w:spacing w:before="240" w:after="240" w:line="312" w:lineRule="atLeast"/>
-        <w:rPr>
-          <w:rFonts w:eastAsia="Times New Roman" w:cstheme="minorHAnsi"/>
-          <w:color w:val="000000"/>
-          <w:sz w:val="28"/>
-          <w:szCs w:val="28"/>
-          <w:shd w:val="clear" w:color="auto" w:fill="F3F4F6"/>
-          <w:lang w:eastAsia="ru-RU"/>
-        </w:rPr>
-      </w:pPr>
-      <w:r>
-        <w:rPr>
-          <w:rFonts w:eastAsia="Times New Roman" w:cstheme="minorHAnsi"/>
-          <w:color w:val="000000"/>
-          <w:sz w:val="28"/>
-          <w:szCs w:val="28"/>
-          <w:shd w:val="clear" w:color="auto" w:fill="F3F4F6"/>
-          <w:lang w:eastAsia="ru-RU"/>
-        </w:rPr>
-        <w:t xml:space="preserve">    </w:t>
-      </w:r>
-      <w:r>
-        <w:rPr>
-          <w:rFonts w:eastAsia="Times New Roman" w:cstheme="minorHAnsi"/>
-          <w:color w:val="000088"/>
-          <w:sz w:val="28"/>
-          <w:szCs w:val="28"/>
-          <w:shd w:val="clear" w:color="auto" w:fill="F3F4F6"/>
-          <w:lang w:eastAsia="ru-RU"/>
-        </w:rPr>
-        <w:t>return</w:t>
-      </w:r>
-      <w:r>
-        <w:rPr>
-          <w:rFonts w:eastAsia="Times New Roman" w:cstheme="minorHAnsi"/>
-          <w:color w:val="000000"/>
-          <w:sz w:val="28"/>
-          <w:szCs w:val="28"/>
-          <w:shd w:val="clear" w:color="auto" w:fill="F3F4F6"/>
-          <w:lang w:eastAsia="ru-RU"/>
-        </w:rPr>
-        <w:t xml:space="preserve"> </w:t>
-      </w:r>
-      <w:r>
-        <w:rPr>
-          <w:rFonts w:eastAsia="Times New Roman" w:cstheme="minorHAnsi"/>
-          <w:color w:val="006666"/>
-          <w:sz w:val="28"/>
-          <w:szCs w:val="28"/>
-          <w:shd w:val="clear" w:color="auto" w:fill="F3F4F6"/>
-          <w:lang w:eastAsia="ru-RU"/>
-        </w:rPr>
-        <w:t>0</w:t>
-      </w:r>
-      <w:r>
-        <w:rPr>
-          <w:rFonts w:eastAsia="Times New Roman" w:cstheme="minorHAnsi"/>
-          <w:color w:val="000000"/>
-          <w:sz w:val="28"/>
-          <w:szCs w:val="28"/>
-          <w:shd w:val="clear" w:color="auto" w:fill="F3F4F6"/>
-          <w:lang w:eastAsia="ru-RU"/>
-        </w:rPr>
-        <w:t>;</w:t>
-      </w:r>
-    </w:p>
-    <w:p>
-      <w:pPr>
-        <w:shd w:val="clear" w:color="auto" w:fill="FFFFFF"/>
+        <w:spacing w:after="0" w:line="240" w:lineRule="auto"/>
+        <w:rPr>
+          <w:rFonts w:ascii="Times New Roman" w:eastAsia="Times New Roman" w:hAnsi="Times New Roman" w:cs="Times New Roman"/>
+          <w:sz w:val="28"/>
+          <w:szCs w:val="28"/>
+          <w:lang w:eastAsia="ru-RU"/>
+        </w:rPr>
+      </w:pPr>
+      <w:r>
+        <w:rPr>
+          <w:rFonts w:ascii="Times New Roman" w:eastAsia="Times New Roman" w:hAnsi="Times New Roman" w:cs="Times New Roman"/>
+          <w:sz w:val="28"/>
+          <w:szCs w:val="28"/>
+          <w:lang w:val="en-US" w:eastAsia="ru-RU"/>
+        </w:rPr>
+        <w:t xml:space="preserve">        </w:t>
+      </w:r>
+      <w:r>
+        <w:rPr>
+          <w:rFonts w:ascii="Times New Roman" w:eastAsia="Times New Roman" w:hAnsi="Times New Roman" w:cs="Times New Roman"/>
+          <w:sz w:val="28"/>
+          <w:szCs w:val="28"/>
+          <w:lang w:eastAsia="ru-RU"/>
+        </w:rPr>
+        <w:t>cout &lt;&lt; i &lt;&lt; endl;</w:t>
+      </w:r>
+    </w:p>
+    <w:p>
+      <w:pPr>
         <w:tabs>
           <w:tab w:val="left" w:pos="916"/>
           <w:tab w:val="left" w:pos="1832"/>
@@ -5232,523 +4946,26 @@
           <w:tab w:val="left" w:pos="13740"/>
           <w:tab w:val="left" w:pos="14656"/>
         </w:tabs>
-        <w:spacing w:before="240" w:after="240" w:line="312" w:lineRule="atLeast"/>
-        <w:rPr>
-          <w:rFonts w:eastAsia="Times New Roman" w:cstheme="minorHAnsi"/>
-          <w:color w:val="000000"/>
-          <w:sz w:val="28"/>
-          <w:szCs w:val="28"/>
-          <w:shd w:val="clear" w:color="auto" w:fill="F3F4F6"/>
-          <w:lang w:eastAsia="ru-RU"/>
-        </w:rPr>
-      </w:pPr>
-      <w:r>
-        <w:rPr>
-          <w:rFonts w:eastAsia="Times New Roman" w:cstheme="minorHAnsi"/>
-          <w:color w:val="000000"/>
-          <w:sz w:val="28"/>
-          <w:szCs w:val="28"/>
-          <w:shd w:val="clear" w:color="auto" w:fill="F3F4F6"/>
-          <w:lang w:eastAsia="ru-RU"/>
-        </w:rPr>
-        <w:t>}</w:t>
-      </w:r>
-    </w:p>
-    <w:p>
-      <w:pPr>
-        <w:shd w:val="clear" w:color="auto" w:fill="FFFFFF"/>
-        <w:spacing w:before="240" w:after="240" w:line="240" w:lineRule="auto"/>
-        <w:rPr>
-          <w:rFonts w:ascii="Times New Roman" w:eastAsia="Times New Roman" w:hAnsi="Times New Roman" w:cs="Times New Roman"/>
-          <w:color w:val="222222"/>
-          <w:sz w:val="28"/>
-          <w:szCs w:val="28"/>
-          <w:lang w:eastAsia="ru-RU"/>
-        </w:rPr>
-      </w:pPr>
-      <w:r>
-        <w:rPr>
-          <w:rFonts w:ascii="Times New Roman" w:eastAsia="Times New Roman" w:hAnsi="Times New Roman" w:cs="Times New Roman"/>
-          <w:color w:val="222222"/>
-          <w:sz w:val="28"/>
-          <w:szCs w:val="28"/>
-          <w:lang w:eastAsia="ru-RU"/>
-        </w:rPr>
-        <w:t>Такой код учит правильно оформлять программу, понимать область видимости переменных и структуру алгоритма.</w:t>
-      </w:r>
-    </w:p>
-    <w:p>
-      <w:pPr>
-        <w:shd w:val="clear" w:color="auto" w:fill="FFFFFF"/>
-        <w:spacing w:before="240" w:after="240" w:line="240" w:lineRule="auto"/>
-        <w:rPr>
-          <w:rFonts w:ascii="Times New Roman" w:eastAsia="Times New Roman" w:hAnsi="Times New Roman" w:cs="Times New Roman"/>
-          <w:color w:val="222222"/>
-          <w:sz w:val="28"/>
-          <w:szCs w:val="28"/>
-          <w:lang w:eastAsia="ru-RU"/>
-        </w:rPr>
-      </w:pPr>
-    </w:p>
-    <w:p>
-      <w:pPr>
-        <w:shd w:val="clear" w:color="auto" w:fill="FFFFFF"/>
-        <w:spacing w:before="240" w:after="240" w:line="240" w:lineRule="auto"/>
-        <w:jc w:val="center"/>
-        <w:rPr>
-          <w:rFonts w:ascii="Times New Roman" w:eastAsia="Times New Roman" w:hAnsi="Times New Roman" w:cs="Times New Roman"/>
-          <w:color w:val="222222"/>
-          <w:sz w:val="28"/>
-          <w:szCs w:val="28"/>
-          <w:lang w:eastAsia="ru-RU"/>
-        </w:rPr>
-      </w:pPr>
-      <w:r>
-        <w:rPr>
-          <w:rFonts w:ascii="Times New Roman" w:eastAsia="Times New Roman" w:hAnsi="Times New Roman" w:cs="Times New Roman"/>
-          <w:b/>
-          <w:bCs/>
-          <w:color w:val="222222"/>
-          <w:sz w:val="28"/>
-          <w:szCs w:val="28"/>
-          <w:lang w:eastAsia="ru-RU"/>
-        </w:rPr>
-        <w:lastRenderedPageBreak/>
-        <w:t>Высокая производительность и контроль над ресурсами</w:t>
-      </w:r>
-    </w:p>
-    <w:p>
-      <w:pPr>
-        <w:shd w:val="clear" w:color="auto" w:fill="FFFFFF"/>
-        <w:spacing w:before="240" w:after="240" w:line="240" w:lineRule="auto"/>
-        <w:ind w:firstLine="708"/>
-        <w:rPr>
-          <w:rFonts w:ascii="Times New Roman" w:eastAsia="Times New Roman" w:hAnsi="Times New Roman" w:cs="Times New Roman"/>
-          <w:color w:val="222222"/>
-          <w:sz w:val="28"/>
-          <w:szCs w:val="28"/>
-          <w:lang w:eastAsia="ru-RU"/>
-        </w:rPr>
-      </w:pPr>
-      <w:r>
-        <w:rPr>
-          <w:rFonts w:ascii="Times New Roman" w:eastAsia="Times New Roman" w:hAnsi="Times New Roman" w:cs="Times New Roman"/>
-          <w:b/>
-          <w:bCs/>
-          <w:color w:val="222222"/>
-          <w:sz w:val="28"/>
-          <w:szCs w:val="28"/>
-          <w:lang w:eastAsia="ru-RU"/>
-        </w:rPr>
-        <w:t>C++</w:t>
-      </w:r>
-      <w:r>
-        <w:rPr>
-          <w:rFonts w:ascii="Times New Roman" w:eastAsia="Times New Roman" w:hAnsi="Times New Roman" w:cs="Times New Roman"/>
-          <w:color w:val="222222"/>
-          <w:sz w:val="28"/>
-          <w:szCs w:val="28"/>
-          <w:lang w:eastAsia="ru-RU"/>
-        </w:rPr>
-        <w:t> позволяет работать на низком уровне с памятью, использовать указатели и эффективно управлять ресурсами. Это делает его идеальным языком для решения сложных и ресурсоёмких задач, что может быть полезно не только на экзамене, но и в будущей карьере программиста.</w:t>
-      </w:r>
-    </w:p>
-    <w:p>
-      <w:pPr>
-        <w:shd w:val="clear" w:color="auto" w:fill="FFFFFF"/>
-        <w:spacing w:before="240" w:after="240" w:line="240" w:lineRule="auto"/>
-        <w:jc w:val="center"/>
-        <w:rPr>
-          <w:rFonts w:ascii="Times New Roman" w:eastAsia="Times New Roman" w:hAnsi="Times New Roman" w:cs="Times New Roman"/>
-          <w:color w:val="222222"/>
-          <w:sz w:val="28"/>
-          <w:szCs w:val="28"/>
-          <w:lang w:eastAsia="ru-RU"/>
-        </w:rPr>
-      </w:pPr>
-      <w:r>
-        <w:rPr>
-          <w:rFonts w:ascii="Times New Roman" w:eastAsia="Times New Roman" w:hAnsi="Times New Roman" w:cs="Times New Roman"/>
-          <w:b/>
-          <w:bCs/>
-          <w:color w:val="222222"/>
-          <w:sz w:val="28"/>
-          <w:szCs w:val="28"/>
-          <w:lang w:eastAsia="ru-RU"/>
-        </w:rPr>
-        <w:t>Популярность в олимпиадном и инженерном программировании</w:t>
-      </w:r>
-    </w:p>
-    <w:p>
-      <w:pPr>
-        <w:shd w:val="clear" w:color="auto" w:fill="FFFFFF"/>
-        <w:spacing w:before="240" w:after="240" w:line="240" w:lineRule="auto"/>
-        <w:ind w:firstLine="708"/>
-        <w:rPr>
-          <w:rFonts w:ascii="Times New Roman" w:eastAsia="Times New Roman" w:hAnsi="Times New Roman" w:cs="Times New Roman"/>
-          <w:color w:val="222222"/>
-          <w:sz w:val="28"/>
-          <w:szCs w:val="28"/>
-          <w:lang w:eastAsia="ru-RU"/>
-        </w:rPr>
-      </w:pPr>
-      <w:r>
-        <w:rPr>
-          <w:rFonts w:ascii="Times New Roman" w:eastAsia="Times New Roman" w:hAnsi="Times New Roman" w:cs="Times New Roman"/>
-          <w:b/>
-          <w:bCs/>
-          <w:color w:val="222222"/>
-          <w:sz w:val="28"/>
-          <w:szCs w:val="28"/>
-          <w:lang w:eastAsia="ru-RU"/>
-        </w:rPr>
-        <w:t>C++</w:t>
-      </w:r>
-      <w:r>
-        <w:rPr>
-          <w:rFonts w:ascii="Times New Roman" w:eastAsia="Times New Roman" w:hAnsi="Times New Roman" w:cs="Times New Roman"/>
-          <w:color w:val="222222"/>
-          <w:sz w:val="28"/>
-          <w:szCs w:val="28"/>
-          <w:lang w:eastAsia="ru-RU"/>
-        </w:rPr>
-        <w:t> — основной язык многих соревнований по программированию, включая Всероссийскую олимпиаду школьников. Он широко используется в разработке игр, системного </w:t>
-      </w:r>
-      <w:r>
-        <w:rPr>
-          <w:rFonts w:ascii="Times New Roman" w:eastAsia="Times New Roman" w:hAnsi="Times New Roman" w:cs="Times New Roman"/>
-          <w:b/>
-          <w:bCs/>
-          <w:color w:val="222222"/>
-          <w:sz w:val="28"/>
-          <w:szCs w:val="28"/>
-          <w:lang w:eastAsia="ru-RU"/>
-        </w:rPr>
-        <w:t>ПО</w:t>
-      </w:r>
-      <w:r>
-        <w:rPr>
-          <w:rFonts w:ascii="Times New Roman" w:eastAsia="Times New Roman" w:hAnsi="Times New Roman" w:cs="Times New Roman"/>
-          <w:color w:val="222222"/>
-          <w:sz w:val="28"/>
-          <w:szCs w:val="28"/>
-          <w:lang w:eastAsia="ru-RU"/>
-        </w:rPr>
-        <w:t>, драйверов, а также в высокопроизводительных системах. Владение </w:t>
-      </w:r>
-      <w:r>
-        <w:rPr>
-          <w:rFonts w:ascii="Times New Roman" w:eastAsia="Times New Roman" w:hAnsi="Times New Roman" w:cs="Times New Roman"/>
-          <w:b/>
-          <w:bCs/>
-          <w:color w:val="222222"/>
-          <w:sz w:val="28"/>
-          <w:szCs w:val="28"/>
-          <w:lang w:eastAsia="ru-RU"/>
-        </w:rPr>
-        <w:t>C++</w:t>
-      </w:r>
-      <w:r>
-        <w:rPr>
-          <w:rFonts w:ascii="Times New Roman" w:eastAsia="Times New Roman" w:hAnsi="Times New Roman" w:cs="Times New Roman"/>
-          <w:color w:val="222222"/>
-          <w:sz w:val="28"/>
-          <w:szCs w:val="28"/>
-          <w:lang w:eastAsia="ru-RU"/>
-        </w:rPr>
-        <w:t> расширяет кругозор школьника и готовит его к профессиональному программированию.</w:t>
-      </w:r>
-    </w:p>
-    <w:p>
-      <w:pPr>
-        <w:shd w:val="clear" w:color="auto" w:fill="FFFFFF"/>
-        <w:spacing w:before="240" w:after="240" w:line="240" w:lineRule="auto"/>
-        <w:jc w:val="center"/>
-        <w:rPr>
-          <w:rFonts w:ascii="Times New Roman" w:eastAsia="Times New Roman" w:hAnsi="Times New Roman" w:cs="Times New Roman"/>
-          <w:color w:val="222222"/>
-          <w:sz w:val="28"/>
-          <w:szCs w:val="28"/>
-          <w:lang w:eastAsia="ru-RU"/>
-        </w:rPr>
-      </w:pPr>
-      <w:r>
-        <w:rPr>
-          <w:rFonts w:ascii="Times New Roman" w:eastAsia="Times New Roman" w:hAnsi="Times New Roman" w:cs="Times New Roman"/>
-          <w:b/>
-          <w:bCs/>
-          <w:color w:val="222222"/>
-          <w:sz w:val="28"/>
-          <w:szCs w:val="28"/>
-          <w:lang w:eastAsia="ru-RU"/>
-        </w:rPr>
-        <w:t>Совместимость с экзаменационными задачами</w:t>
-      </w:r>
-    </w:p>
-    <w:p>
-      <w:pPr>
-        <w:shd w:val="clear" w:color="auto" w:fill="FFFFFF"/>
-        <w:spacing w:before="240" w:after="240" w:line="240" w:lineRule="auto"/>
-        <w:ind w:firstLine="708"/>
-        <w:rPr>
-          <w:rFonts w:ascii="Times New Roman" w:eastAsia="Times New Roman" w:hAnsi="Times New Roman" w:cs="Times New Roman"/>
-          <w:color w:val="222222"/>
-          <w:sz w:val="28"/>
-          <w:szCs w:val="28"/>
-          <w:lang w:eastAsia="ru-RU"/>
-        </w:rPr>
-      </w:pPr>
-      <w:r>
-        <w:rPr>
-          <w:rFonts w:ascii="Times New Roman" w:eastAsia="Times New Roman" w:hAnsi="Times New Roman" w:cs="Times New Roman"/>
-          <w:color w:val="222222"/>
-          <w:sz w:val="28"/>
-          <w:szCs w:val="28"/>
-          <w:lang w:eastAsia="ru-RU"/>
-        </w:rPr>
-        <w:t>На </w:t>
-      </w:r>
-      <w:r>
-        <w:rPr>
-          <w:rFonts w:ascii="Times New Roman" w:eastAsia="Times New Roman" w:hAnsi="Times New Roman" w:cs="Times New Roman"/>
-          <w:b/>
-          <w:bCs/>
-          <w:color w:val="222222"/>
-          <w:sz w:val="28"/>
-          <w:szCs w:val="28"/>
-          <w:lang w:eastAsia="ru-RU"/>
-        </w:rPr>
-        <w:t>ОГЭ</w:t>
-      </w:r>
-      <w:r>
-        <w:rPr>
-          <w:rFonts w:ascii="Times New Roman" w:eastAsia="Times New Roman" w:hAnsi="Times New Roman" w:cs="Times New Roman"/>
-          <w:color w:val="222222"/>
-          <w:sz w:val="28"/>
-          <w:szCs w:val="28"/>
-          <w:lang w:eastAsia="ru-RU"/>
-        </w:rPr>
-        <w:t> допускается использование </w:t>
-      </w:r>
-      <w:r>
-        <w:rPr>
-          <w:rFonts w:ascii="Times New Roman" w:eastAsia="Times New Roman" w:hAnsi="Times New Roman" w:cs="Times New Roman"/>
-          <w:b/>
-          <w:bCs/>
-          <w:color w:val="222222"/>
-          <w:sz w:val="28"/>
-          <w:szCs w:val="28"/>
-          <w:lang w:eastAsia="ru-RU"/>
-        </w:rPr>
-        <w:t>C++</w:t>
-      </w:r>
-      <w:r>
-        <w:rPr>
-          <w:rFonts w:ascii="Times New Roman" w:eastAsia="Times New Roman" w:hAnsi="Times New Roman" w:cs="Times New Roman"/>
-          <w:color w:val="222222"/>
-          <w:sz w:val="28"/>
-          <w:szCs w:val="28"/>
-          <w:lang w:eastAsia="ru-RU"/>
-        </w:rPr>
-        <w:t>, и его возможностей достаточно для решения всех типов заданий: работа с циклами, условиями, массивами, строками и файлами. Несмотря на большую строгость по сравнению с </w:t>
-      </w:r>
-      <w:r>
-        <w:rPr>
-          <w:rFonts w:ascii="Times New Roman" w:eastAsia="Times New Roman" w:hAnsi="Times New Roman" w:cs="Times New Roman"/>
-          <w:b/>
-          <w:bCs/>
-          <w:color w:val="222222"/>
-          <w:sz w:val="28"/>
-          <w:szCs w:val="28"/>
-          <w:lang w:eastAsia="ru-RU"/>
-        </w:rPr>
-        <w:t>Python</w:t>
-      </w:r>
-      <w:r>
-        <w:rPr>
-          <w:rFonts w:ascii="Times New Roman" w:eastAsia="Times New Roman" w:hAnsi="Times New Roman" w:cs="Times New Roman"/>
-          <w:color w:val="222222"/>
-          <w:sz w:val="28"/>
-          <w:szCs w:val="28"/>
-          <w:lang w:eastAsia="ru-RU"/>
-        </w:rPr>
-        <w:t>, </w:t>
-      </w:r>
-      <w:r>
-        <w:rPr>
-          <w:rFonts w:ascii="Times New Roman" w:eastAsia="Times New Roman" w:hAnsi="Times New Roman" w:cs="Times New Roman"/>
-          <w:b/>
-          <w:bCs/>
-          <w:color w:val="222222"/>
-          <w:sz w:val="28"/>
-          <w:szCs w:val="28"/>
-          <w:lang w:eastAsia="ru-RU"/>
-        </w:rPr>
-        <w:t>C++</w:t>
-      </w:r>
-      <w:r>
-        <w:rPr>
-          <w:rFonts w:ascii="Times New Roman" w:eastAsia="Times New Roman" w:hAnsi="Times New Roman" w:cs="Times New Roman"/>
-          <w:color w:val="222222"/>
-          <w:sz w:val="28"/>
-          <w:szCs w:val="28"/>
-          <w:lang w:eastAsia="ru-RU"/>
-        </w:rPr>
-        <w:t> даёт более точное представление об алгоритмах и логике их реализации.</w:t>
-      </w:r>
-    </w:p>
-    <w:p>
-      <w:pPr>
-        <w:shd w:val="clear" w:color="auto" w:fill="FFFFFF"/>
-        <w:spacing w:before="240" w:after="240" w:line="240" w:lineRule="auto"/>
-        <w:ind w:firstLine="708"/>
-        <w:rPr>
-          <w:rFonts w:ascii="Times New Roman" w:eastAsia="Times New Roman" w:hAnsi="Times New Roman" w:cs="Times New Roman"/>
-          <w:color w:val="222222"/>
-          <w:sz w:val="28"/>
-          <w:szCs w:val="28"/>
-          <w:lang w:eastAsia="ru-RU"/>
-        </w:rPr>
-      </w:pPr>
-    </w:p>
-    <w:p>
-      <w:pPr>
-        <w:shd w:val="clear" w:color="auto" w:fill="FFFFFF"/>
-        <w:spacing w:before="240" w:after="240" w:line="240" w:lineRule="auto"/>
-        <w:jc w:val="center"/>
-        <w:rPr>
-          <w:rFonts w:ascii="Times New Roman" w:eastAsia="Times New Roman" w:hAnsi="Times New Roman" w:cs="Times New Roman"/>
-          <w:color w:val="222222"/>
-          <w:sz w:val="28"/>
-          <w:szCs w:val="28"/>
-          <w:lang w:eastAsia="ru-RU"/>
-        </w:rPr>
-      </w:pPr>
-      <w:r>
-        <w:rPr>
-          <w:rFonts w:ascii="Times New Roman" w:eastAsia="Times New Roman" w:hAnsi="Times New Roman" w:cs="Times New Roman"/>
-          <w:b/>
-          <w:bCs/>
-          <w:color w:val="222222"/>
-          <w:sz w:val="28"/>
-          <w:szCs w:val="28"/>
-          <w:lang w:eastAsia="ru-RU"/>
-        </w:rPr>
-        <w:t>Пример решения задачи на C++</w:t>
-      </w:r>
-    </w:p>
-    <w:p>
-      <w:pPr>
-        <w:shd w:val="clear" w:color="auto" w:fill="FFFFFF"/>
-        <w:spacing w:before="240" w:after="240" w:line="240" w:lineRule="auto"/>
-        <w:rPr>
-          <w:rFonts w:ascii="Times New Roman" w:eastAsia="Times New Roman" w:hAnsi="Times New Roman" w:cs="Times New Roman"/>
-          <w:color w:val="222222"/>
-          <w:sz w:val="28"/>
-          <w:szCs w:val="28"/>
-          <w:lang w:eastAsia="ru-RU"/>
-        </w:rPr>
-      </w:pPr>
-      <w:r>
-        <w:rPr>
-          <w:rFonts w:ascii="Times New Roman" w:eastAsia="Times New Roman" w:hAnsi="Times New Roman" w:cs="Times New Roman"/>
-          <w:b/>
-          <w:bCs/>
-          <w:color w:val="222222"/>
-          <w:sz w:val="28"/>
-          <w:szCs w:val="28"/>
-          <w:lang w:eastAsia="ru-RU"/>
-        </w:rPr>
-        <w:t>Задача:</w:t>
-      </w:r>
-    </w:p>
-    <w:p>
-      <w:pPr>
-        <w:shd w:val="clear" w:color="auto" w:fill="FFFFFF"/>
-        <w:spacing w:before="240" w:after="240" w:line="240" w:lineRule="auto"/>
-        <w:rPr>
-          <w:rFonts w:ascii="Times New Roman" w:eastAsia="Times New Roman" w:hAnsi="Times New Roman" w:cs="Times New Roman"/>
-          <w:color w:val="222222"/>
-          <w:sz w:val="28"/>
-          <w:szCs w:val="28"/>
-          <w:lang w:eastAsia="ru-RU"/>
-        </w:rPr>
-      </w:pPr>
-      <w:r>
-        <w:rPr>
-          <w:rFonts w:ascii="Times New Roman" w:eastAsia="Times New Roman" w:hAnsi="Times New Roman" w:cs="Times New Roman"/>
-          <w:color w:val="222222"/>
-          <w:sz w:val="28"/>
-          <w:szCs w:val="28"/>
-          <w:lang w:eastAsia="ru-RU"/>
-        </w:rPr>
-        <w:t>Дан список целых чисел {10, 20, 30, 40, 50} и число X = 35. Подсчитайте количество элементов больше X.</w:t>
-      </w:r>
-    </w:p>
-    <w:p>
-      <w:pPr>
-        <w:shd w:val="clear" w:color="auto" w:fill="FFFFFF"/>
-        <w:spacing w:before="240" w:after="240" w:line="240" w:lineRule="auto"/>
-        <w:rPr>
-          <w:rFonts w:ascii="Times New Roman" w:eastAsia="Times New Roman" w:hAnsi="Times New Roman" w:cs="Times New Roman"/>
-          <w:color w:val="222222"/>
-          <w:sz w:val="28"/>
-          <w:szCs w:val="28"/>
-          <w:lang w:val="en-US" w:eastAsia="ru-RU"/>
-        </w:rPr>
-      </w:pPr>
-      <w:r>
-        <w:rPr>
-          <w:rFonts w:ascii="Times New Roman" w:eastAsia="Times New Roman" w:hAnsi="Times New Roman" w:cs="Times New Roman"/>
-          <w:b/>
-          <w:bCs/>
-          <w:color w:val="222222"/>
-          <w:sz w:val="28"/>
-          <w:szCs w:val="28"/>
-          <w:lang w:eastAsia="ru-RU"/>
-        </w:rPr>
-        <w:t>Решение</w:t>
-      </w:r>
-      <w:r>
-        <w:rPr>
-          <w:rFonts w:ascii="Times New Roman" w:eastAsia="Times New Roman" w:hAnsi="Times New Roman" w:cs="Times New Roman"/>
-          <w:b/>
-          <w:bCs/>
-          <w:color w:val="222222"/>
-          <w:sz w:val="28"/>
-          <w:szCs w:val="28"/>
-          <w:lang w:val="en-US" w:eastAsia="ru-RU"/>
-        </w:rPr>
-        <w:t xml:space="preserve"> </w:t>
-      </w:r>
-      <w:r>
-        <w:rPr>
-          <w:rFonts w:ascii="Times New Roman" w:eastAsia="Times New Roman" w:hAnsi="Times New Roman" w:cs="Times New Roman"/>
-          <w:b/>
-          <w:bCs/>
-          <w:color w:val="222222"/>
-          <w:sz w:val="28"/>
-          <w:szCs w:val="28"/>
-          <w:lang w:eastAsia="ru-RU"/>
-        </w:rPr>
-        <w:t>на</w:t>
-      </w:r>
-      <w:r>
-        <w:rPr>
-          <w:rFonts w:ascii="Times New Roman" w:eastAsia="Times New Roman" w:hAnsi="Times New Roman" w:cs="Times New Roman"/>
-          <w:b/>
-          <w:bCs/>
-          <w:color w:val="222222"/>
-          <w:sz w:val="28"/>
-          <w:szCs w:val="28"/>
-          <w:lang w:val="en-US" w:eastAsia="ru-RU"/>
-        </w:rPr>
-        <w:t xml:space="preserve"> C++:</w:t>
-      </w:r>
-    </w:p>
-    <w:p>
-      <w:pPr>
-        <w:shd w:val="clear" w:color="auto" w:fill="FFFFFF"/>
+        <w:spacing w:after="0" w:line="240" w:lineRule="auto"/>
+        <w:rPr>
+          <w:rFonts w:ascii="Times New Roman" w:eastAsia="Times New Roman" w:hAnsi="Times New Roman" w:cs="Times New Roman"/>
+          <w:sz w:val="28"/>
+          <w:szCs w:val="28"/>
+          <w:lang w:eastAsia="ru-RU"/>
+        </w:rPr>
+      </w:pPr>
+      <w:r>
+        <w:rPr>
+          <w:rFonts w:ascii="Times New Roman" w:eastAsia="Times New Roman" w:hAnsi="Times New Roman" w:cs="Times New Roman"/>
+          <w:sz w:val="28"/>
+          <w:szCs w:val="28"/>
+          <w:lang w:eastAsia="ru-RU"/>
+        </w:rPr>
+        <w:t>    }</w:t>
+      </w:r>
+    </w:p>
+    <w:p>
+      <w:pPr>
         <w:tabs>
           <w:tab w:val="left" w:pos="916"/>
           <w:tab w:val="left" w:pos="1832"/>
@@ -5767,64 +4984,26 @@
           <w:tab w:val="left" w:pos="13740"/>
           <w:tab w:val="left" w:pos="14656"/>
         </w:tabs>
-        <w:spacing w:before="240" w:after="240" w:line="312" w:lineRule="atLeast"/>
-        <w:rPr>
-          <w:rFonts w:ascii="Times New Roman" w:eastAsia="Times New Roman" w:hAnsi="Times New Roman" w:cs="Times New Roman"/>
-          <w:color w:val="000000"/>
-          <w:sz w:val="28"/>
-          <w:szCs w:val="28"/>
-          <w:shd w:val="clear" w:color="auto" w:fill="F3F4F6"/>
-          <w:lang w:val="en-US" w:eastAsia="ru-RU"/>
-        </w:rPr>
-      </w:pPr>
-      <w:r>
-        <w:rPr>
-          <w:rFonts w:ascii="Times New Roman" w:eastAsia="Times New Roman" w:hAnsi="Times New Roman" w:cs="Times New Roman"/>
-          <w:color w:val="006666"/>
-          <w:sz w:val="28"/>
-          <w:szCs w:val="28"/>
-          <w:shd w:val="clear" w:color="auto" w:fill="F3F4F6"/>
-          <w:lang w:val="en-US" w:eastAsia="ru-RU"/>
-        </w:rPr>
-        <w:t>#</w:t>
-      </w:r>
-      <w:r>
-        <w:rPr>
-          <w:rFonts w:ascii="Times New Roman" w:eastAsia="Times New Roman" w:hAnsi="Times New Roman" w:cs="Times New Roman"/>
-          <w:color w:val="000088"/>
-          <w:sz w:val="28"/>
-          <w:szCs w:val="28"/>
-          <w:shd w:val="clear" w:color="auto" w:fill="F3F4F6"/>
-          <w:lang w:val="en-US" w:eastAsia="ru-RU"/>
-        </w:rPr>
-        <w:t>include</w:t>
-      </w:r>
-      <w:r>
-        <w:rPr>
-          <w:rFonts w:ascii="Times New Roman" w:eastAsia="Times New Roman" w:hAnsi="Times New Roman" w:cs="Times New Roman"/>
-          <w:color w:val="006666"/>
-          <w:sz w:val="28"/>
-          <w:szCs w:val="28"/>
-          <w:shd w:val="clear" w:color="auto" w:fill="F3F4F6"/>
-          <w:lang w:val="en-US" w:eastAsia="ru-RU"/>
-        </w:rPr>
-        <w:t xml:space="preserve"> </w:t>
-      </w:r>
-      <w:r>
-        <w:rPr>
-          <w:rFonts w:ascii="Times New Roman" w:eastAsia="Times New Roman" w:hAnsi="Times New Roman" w:cs="Times New Roman"/>
-          <w:color w:val="008800"/>
-          <w:sz w:val="28"/>
-          <w:szCs w:val="28"/>
-          <w:shd w:val="clear" w:color="auto" w:fill="F3F4F6"/>
-          <w:lang w:val="en-US" w:eastAsia="ru-RU"/>
-        </w:rPr>
-        <w:t>&lt;iostream&gt;</w:t>
-      </w:r>
-    </w:p>
-    <w:p>
-      <w:pPr>
-        <w:shd w:val="clear" w:color="auto" w:fill="FFFFFF"/>
+        <w:spacing w:after="0" w:line="240" w:lineRule="auto"/>
+        <w:rPr>
+          <w:rFonts w:ascii="Times New Roman" w:eastAsia="Times New Roman" w:hAnsi="Times New Roman" w:cs="Times New Roman"/>
+          <w:sz w:val="28"/>
+          <w:szCs w:val="28"/>
+          <w:lang w:eastAsia="ru-RU"/>
+        </w:rPr>
+      </w:pPr>
+      <w:r>
+        <w:rPr>
+          <w:rFonts w:ascii="Times New Roman" w:eastAsia="Times New Roman" w:hAnsi="Times New Roman" w:cs="Times New Roman"/>
+          <w:sz w:val="28"/>
+          <w:szCs w:val="28"/>
+          <w:lang w:eastAsia="ru-RU"/>
+        </w:rPr>
+        <w:t>    return 0;</w:t>
+      </w:r>
+    </w:p>
+    <w:p>
+      <w:pPr>
         <w:tabs>
           <w:tab w:val="left" w:pos="916"/>
           <w:tab w:val="left" w:pos="1832"/>
@@ -5843,64 +5022,623 @@
           <w:tab w:val="left" w:pos="13740"/>
           <w:tab w:val="left" w:pos="14656"/>
         </w:tabs>
-        <w:spacing w:before="240" w:after="240" w:line="312" w:lineRule="atLeast"/>
-        <w:rPr>
-          <w:rFonts w:ascii="Times New Roman" w:eastAsia="Times New Roman" w:hAnsi="Times New Roman" w:cs="Times New Roman"/>
-          <w:color w:val="000000"/>
-          <w:sz w:val="28"/>
-          <w:szCs w:val="28"/>
-          <w:shd w:val="clear" w:color="auto" w:fill="F3F4F6"/>
+        <w:spacing w:after="0" w:line="240" w:lineRule="auto"/>
+        <w:rPr>
+          <w:rFonts w:ascii="Times New Roman" w:eastAsia="Times New Roman" w:hAnsi="Times New Roman" w:cs="Times New Roman"/>
+          <w:sz w:val="28"/>
+          <w:szCs w:val="28"/>
+          <w:lang w:eastAsia="ru-RU"/>
+        </w:rPr>
+      </w:pPr>
+      <w:r>
+        <w:rPr>
+          <w:rFonts w:ascii="Times New Roman" w:eastAsia="Times New Roman" w:hAnsi="Times New Roman" w:cs="Times New Roman"/>
+          <w:sz w:val="28"/>
+          <w:szCs w:val="28"/>
+          <w:lang w:eastAsia="ru-RU"/>
+        </w:rPr>
+        <w:t>}</w:t>
+      </w:r>
+    </w:p>
+    <w:p>
+      <w:pPr>
+        <w:spacing w:after="0" w:line="240" w:lineRule="auto"/>
+        <w:rPr>
+          <w:rFonts w:ascii="Times New Roman" w:eastAsia="Times New Roman" w:hAnsi="Times New Roman" w:cs="Times New Roman"/>
+          <w:sz w:val="28"/>
+          <w:szCs w:val="28"/>
+          <w:lang w:eastAsia="ru-RU"/>
+        </w:rPr>
+      </w:pPr>
+      <w:r>
+        <w:rPr>
+          <w:rFonts w:ascii="Times New Roman" w:eastAsia="Times New Roman" w:hAnsi="Times New Roman" w:cs="Times New Roman"/>
+          <w:noProof/>
+          <w:sz w:val="28"/>
+          <w:szCs w:val="28"/>
+          <w:lang w:eastAsia="ru-RU"/>
+        </w:rPr>
+        <mc:AlternateContent>
+          <mc:Choice Requires="wps">
+            <w:drawing>
+              <wp:inline distT="0" distB="0" distL="0" distR="0">
+                <wp:extent cx="304800" cy="304800"/>
+                <wp:effectExtent l="0" t="0" r="0" b="0"/>
+                <wp:docPr id="8" name="Прямоугольник 8" descr="data:image/gif;base64,R0lGODlhAQABAPABAP///wAAACH5BAEKAAAALAAAAAABAAEAAAICRAEAOw=="/>
+                <wp:cNvGraphicFramePr>
+                  <a:graphicFrameLocks xmlns:a="http://schemas.openxmlformats.org/drawingml/2006/main" noChangeAspect="1"/>
+                </wp:cNvGraphicFramePr>
+                <a:graphic xmlns:a="http://schemas.openxmlformats.org/drawingml/2006/main">
+                  <a:graphicData uri="http://schemas.microsoft.com/office/word/2010/wordprocessingShape">
+                    <wps:wsp>
+                      <wps:cNvSpPr>
+                        <a:spLocks noChangeAspect="1" noChangeArrowheads="1"/>
+                      </wps:cNvSpPr>
+                      <wps:spPr bwMode="auto">
+                        <a:xfrm>
+                          <a:off x="0" y="0"/>
+                          <a:ext cx="304800" cy="304800"/>
+                        </a:xfrm>
+                        <a:prstGeom prst="rect">
+                          <a:avLst/>
+                        </a:prstGeom>
+                        <a:noFill/>
+                        <a:ln>
+                          <a:noFill/>
+                        </a:ln>
+                        <a:extLst>
+                          <a:ext uri="{909E8E84-426E-40DD-AFC4-6F175D3DCCD1}">
+                            <a14:hiddenFill xmlns:a14="http://schemas.microsoft.com/office/drawing/2010/main">
+                              <a:solidFill>
+                                <a:srgbClr val="FFFFFF"/>
+                              </a:solidFill>
+                            </a14:hiddenFill>
+                          </a:ext>
+                          <a:ext uri="{91240B29-F687-4F45-9708-019B960494DF}">
+                            <a14:hiddenLine xmlns:a14="http://schemas.microsoft.com/office/drawing/2010/main" w="9525">
+                              <a:solidFill>
+                                <a:srgbClr val="000000"/>
+                              </a:solidFill>
+                              <a:miter lim="800000"/>
+                              <a:headEnd/>
+                              <a:tailEnd/>
+                            </a14:hiddenLine>
+                          </a:ext>
+                        </a:extLst>
+                      </wps:spPr>
+                      <wps:bodyPr rot="0" vert="horz" wrap="square" lIns="91440" tIns="45720" rIns="91440" bIns="45720" anchor="t" anchorCtr="0" upright="1">
+                        <a:noAutofit/>
+                      </wps:bodyPr>
+                    </wps:wsp>
+                  </a:graphicData>
+                </a:graphic>
+              </wp:inline>
+            </w:drawing>
+          </mc:Choice>
+          <mc:Fallback>
+            <w:pict>
+              <v:rect w14:anchorId="623E18F7" id="Прямоугольник 8" o:spid="_x0000_s1026" alt="data:image/gif;base64,R0lGODlhAQABAPABAP///wAAACH5BAEKAAAALAAAAAABAAEAAAICRAEAOw==" style="width:24pt;height:24pt;visibility:visible;mso-wrap-style:square;mso-left-percent:-10001;mso-top-percent:-10001;mso-position-horizontal:absolute;mso-position-horizontal-relative:char;mso-position-vertical:absolute;mso-position-vertical-relative:line;mso-left-percent:-10001;mso-top-percent:-10001;v-text-anchor:top" o:gfxdata="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" filled="f" stroked="f">
+                <o:lock v:ext="edit" aspectratio="t"/>
+                <w10:anchorlock/>
+              </v:rect>
+            </w:pict>
+          </mc:Fallback>
+        </mc:AlternateContent>
+      </w:r>
+      <w:r>
+        <w:rPr>
+          <w:rFonts w:ascii="Times New Roman" w:eastAsia="Times New Roman" w:hAnsi="Times New Roman" w:cs="Times New Roman"/>
+          <w:noProof/>
+          <w:sz w:val="28"/>
+          <w:szCs w:val="28"/>
+          <w:lang w:eastAsia="ru-RU"/>
+        </w:rPr>
+        <mc:AlternateContent>
+          <mc:Choice Requires="wps">
+            <w:drawing>
+              <wp:inline distT="0" distB="0" distL="0" distR="0">
+                <wp:extent cx="144780" cy="144780"/>
+                <wp:effectExtent l="0" t="0" r="0" b="0"/>
+                <wp:docPr id="7" name="Прямоугольник 7" descr="data:image/gif;base64,R0lGODlhAQABAPABAP///wAAACH5BAEKAAAALAAAAAABAAEAAAICRAEAOw=="/>
+                <wp:cNvGraphicFramePr>
+                  <a:graphicFrameLocks xmlns:a="http://schemas.openxmlformats.org/drawingml/2006/main" noChangeAspect="1"/>
+                </wp:cNvGraphicFramePr>
+                <a:graphic xmlns:a="http://schemas.openxmlformats.org/drawingml/2006/main">
+                  <a:graphicData uri="http://schemas.microsoft.com/office/word/2010/wordprocessingShape">
+                    <wps:wsp>
+                      <wps:cNvSpPr>
+                        <a:spLocks noChangeAspect="1" noChangeArrowheads="1"/>
+                      </wps:cNvSpPr>
+                      <wps:spPr bwMode="auto">
+                        <a:xfrm>
+                          <a:off x="0" y="0"/>
+                          <a:ext cx="144780" cy="144780"/>
+                        </a:xfrm>
+                        <a:prstGeom prst="rect">
+                          <a:avLst/>
+                        </a:prstGeom>
+                        <a:noFill/>
+                        <a:ln>
+                          <a:noFill/>
+                        </a:ln>
+                        <a:extLst>
+                          <a:ext uri="{909E8E84-426E-40DD-AFC4-6F175D3DCCD1}">
+                            <a14:hiddenFill xmlns:a14="http://schemas.microsoft.com/office/drawing/2010/main">
+                              <a:solidFill>
+                                <a:srgbClr val="FFFFFF"/>
+                              </a:solidFill>
+                            </a14:hiddenFill>
+                          </a:ext>
+                          <a:ext uri="{91240B29-F687-4F45-9708-019B960494DF}">
+                            <a14:hiddenLine xmlns:a14="http://schemas.microsoft.com/office/drawing/2010/main" w="9525">
+                              <a:solidFill>
+                                <a:srgbClr val="000000"/>
+                              </a:solidFill>
+                              <a:miter lim="800000"/>
+                              <a:headEnd/>
+                              <a:tailEnd/>
+                            </a14:hiddenLine>
+                          </a:ext>
+                        </a:extLst>
+                      </wps:spPr>
+                      <wps:bodyPr rot="0" vert="horz" wrap="square" lIns="91440" tIns="45720" rIns="91440" bIns="45720" anchor="t" anchorCtr="0" upright="1">
+                        <a:noAutofit/>
+                      </wps:bodyPr>
+                    </wps:wsp>
+                  </a:graphicData>
+                </a:graphic>
+              </wp:inline>
+            </w:drawing>
+          </mc:Choice>
+          <mc:Fallback>
+            <w:pict>
+              <v:rect w14:anchorId="20B55AA6" id="Прямоугольник 7" o:spid="_x0000_s1026" alt="data:image/gif;base64,R0lGODlhAQABAPABAP///wAAACH5BAEKAAAALAAAAAABAAEAAAICRAEAOw==" style="width:11.4pt;height:11.4pt;visibility:visible;mso-wrap-style:square;mso-left-percent:-10001;mso-top-percent:-10001;mso-position-horizontal:absolute;mso-position-horizontal-relative:char;mso-position-vertical:absolute;mso-position-vertical-relative:line;mso-left-percent:-10001;mso-top-percent:-10001;v-text-anchor:top" o:gfxdata="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" filled="f" stroked="f">
+                <o:lock v:ext="edit" aspectratio="t"/>
+                <w10:anchorlock/>
+              </v:rect>
+            </w:pict>
+          </mc:Fallback>
+        </mc:AlternateContent>
+      </w:r>
+    </w:p>
+    <w:p>
+      <w:pPr>
+        <w:spacing w:before="100" w:beforeAutospacing="1" w:after="100" w:afterAutospacing="1" w:line="240" w:lineRule="auto"/>
+        <w:rPr>
+          <w:rFonts w:ascii="Times New Roman" w:eastAsia="Times New Roman" w:hAnsi="Times New Roman" w:cs="Times New Roman"/>
+          <w:sz w:val="28"/>
+          <w:szCs w:val="28"/>
+          <w:lang w:eastAsia="ru-RU"/>
+        </w:rPr>
+      </w:pPr>
+      <w:r>
+        <w:rPr>
+          <w:rFonts w:ascii="Times New Roman" w:eastAsia="Times New Roman" w:hAnsi="Times New Roman" w:cs="Times New Roman"/>
+          <w:sz w:val="28"/>
+          <w:szCs w:val="28"/>
+          <w:lang w:eastAsia="ru-RU"/>
+        </w:rPr>
+        <w:t>Такой код учит правильно оформлять программу, понимать область видимости переменных и структуру алгоритма.</w:t>
+      </w:r>
+    </w:p>
+    <w:p>
+      <w:pPr>
+        <w:spacing w:before="100" w:beforeAutospacing="1" w:after="100" w:afterAutospacing="1" w:line="240" w:lineRule="auto"/>
+        <w:rPr>
+          <w:rFonts w:ascii="Times New Roman" w:eastAsia="Times New Roman" w:hAnsi="Times New Roman" w:cs="Times New Roman"/>
+          <w:sz w:val="28"/>
+          <w:szCs w:val="28"/>
+          <w:lang w:eastAsia="ru-RU"/>
+        </w:rPr>
+      </w:pPr>
+    </w:p>
+    <w:p>
+      <w:pPr>
+        <w:spacing w:before="100" w:beforeAutospacing="1" w:after="100" w:afterAutospacing="1" w:line="240" w:lineRule="auto"/>
+        <w:rPr>
+          <w:rFonts w:ascii="Times New Roman" w:eastAsia="Times New Roman" w:hAnsi="Times New Roman" w:cs="Times New Roman"/>
+          <w:sz w:val="28"/>
+          <w:szCs w:val="28"/>
+          <w:lang w:eastAsia="ru-RU"/>
+        </w:rPr>
+      </w:pPr>
+      <w:bookmarkStart w:id="0" w:name="_GoBack"/>
+      <w:bookmarkEnd w:id="0"/>
+    </w:p>
+    <w:p>
+      <w:pPr>
+        <w:spacing w:before="100" w:beforeAutospacing="1" w:after="100" w:afterAutospacing="1" w:line="240" w:lineRule="auto"/>
+        <w:jc w:val="center"/>
+        <w:rPr>
+          <w:rFonts w:ascii="Times New Roman" w:eastAsia="Times New Roman" w:hAnsi="Times New Roman" w:cs="Times New Roman"/>
+          <w:sz w:val="28"/>
+          <w:szCs w:val="28"/>
+          <w:lang w:eastAsia="ru-RU"/>
+        </w:rPr>
+      </w:pPr>
+      <w:r>
+        <w:rPr>
+          <w:rFonts w:ascii="Times New Roman" w:eastAsia="Times New Roman" w:hAnsi="Times New Roman" w:cs="Times New Roman"/>
+          <w:b/>
+          <w:bCs/>
+          <w:sz w:val="28"/>
+          <w:szCs w:val="28"/>
+          <w:lang w:eastAsia="ru-RU"/>
+        </w:rPr>
+        <w:lastRenderedPageBreak/>
+        <w:t>Высокая производительность и контроль над ресурсами</w:t>
+      </w:r>
+    </w:p>
+    <w:p>
+      <w:pPr>
+        <w:spacing w:before="100" w:beforeAutospacing="1" w:after="100" w:afterAutospacing="1" w:line="240" w:lineRule="auto"/>
+        <w:rPr>
+          <w:rFonts w:ascii="Times New Roman" w:eastAsia="Times New Roman" w:hAnsi="Times New Roman" w:cs="Times New Roman"/>
+          <w:sz w:val="28"/>
+          <w:szCs w:val="28"/>
+          <w:lang w:eastAsia="ru-RU"/>
+        </w:rPr>
+      </w:pPr>
+      <w:r>
+        <w:rPr>
+          <w:rFonts w:ascii="Times New Roman" w:eastAsia="Times New Roman" w:hAnsi="Times New Roman" w:cs="Times New Roman"/>
+          <w:b/>
+          <w:bCs/>
+          <w:sz w:val="28"/>
+          <w:szCs w:val="28"/>
+          <w:lang w:eastAsia="ru-RU"/>
+        </w:rPr>
+        <w:t>C++</w:t>
+      </w:r>
+      <w:r>
+        <w:rPr>
+          <w:rFonts w:ascii="Times New Roman" w:eastAsia="Times New Roman" w:hAnsi="Times New Roman" w:cs="Times New Roman"/>
+          <w:sz w:val="28"/>
+          <w:szCs w:val="28"/>
+          <w:lang w:eastAsia="ru-RU"/>
+        </w:rPr>
+        <w:t xml:space="preserve"> позволяет работать на низком уровне с памятью, использовать указатели и эффективно управлять ресурсами. Это делает его идеальным языком для решения сложных и ресурсоёмких задач, что может быть полезно не только на экзамене, но и в будущей карьере программиста.</w:t>
+      </w:r>
+    </w:p>
+    <w:p>
+      <w:pPr>
+        <w:spacing w:before="100" w:beforeAutospacing="1" w:after="100" w:afterAutospacing="1" w:line="240" w:lineRule="auto"/>
+        <w:jc w:val="center"/>
+        <w:rPr>
+          <w:rFonts w:ascii="Times New Roman" w:eastAsia="Times New Roman" w:hAnsi="Times New Roman" w:cs="Times New Roman"/>
+          <w:sz w:val="28"/>
+          <w:szCs w:val="28"/>
+          <w:lang w:eastAsia="ru-RU"/>
+        </w:rPr>
+      </w:pPr>
+      <w:r>
+        <w:rPr>
+          <w:rFonts w:ascii="Times New Roman" w:eastAsia="Times New Roman" w:hAnsi="Times New Roman" w:cs="Times New Roman"/>
+          <w:b/>
+          <w:bCs/>
+          <w:sz w:val="28"/>
+          <w:szCs w:val="28"/>
+          <w:lang w:eastAsia="ru-RU"/>
+        </w:rPr>
+        <w:t>Популярность в олимпиадном и инженерном программировании</w:t>
+      </w:r>
+    </w:p>
+    <w:p>
+      <w:pPr>
+        <w:spacing w:before="100" w:beforeAutospacing="1" w:after="100" w:afterAutospacing="1" w:line="240" w:lineRule="auto"/>
+        <w:rPr>
+          <w:rFonts w:ascii="Times New Roman" w:eastAsia="Times New Roman" w:hAnsi="Times New Roman" w:cs="Times New Roman"/>
+          <w:sz w:val="28"/>
+          <w:szCs w:val="28"/>
+          <w:lang w:eastAsia="ru-RU"/>
+        </w:rPr>
+      </w:pPr>
+      <w:r>
+        <w:rPr>
+          <w:rFonts w:ascii="Times New Roman" w:eastAsia="Times New Roman" w:hAnsi="Times New Roman" w:cs="Times New Roman"/>
+          <w:b/>
+          <w:bCs/>
+          <w:sz w:val="28"/>
+          <w:szCs w:val="28"/>
+          <w:lang w:eastAsia="ru-RU"/>
+        </w:rPr>
+        <w:t>C++</w:t>
+      </w:r>
+      <w:r>
+        <w:rPr>
+          <w:rFonts w:ascii="Times New Roman" w:eastAsia="Times New Roman" w:hAnsi="Times New Roman" w:cs="Times New Roman"/>
+          <w:sz w:val="28"/>
+          <w:szCs w:val="28"/>
+          <w:lang w:eastAsia="ru-RU"/>
+        </w:rPr>
+        <w:t xml:space="preserve"> — основной язык многих соревнований по программированию, включая Всероссийскую олимпиаду школьников. Он широко используется в разработке игр, системного </w:t>
+      </w:r>
+      <w:r>
+        <w:rPr>
+          <w:rFonts w:ascii="Times New Roman" w:eastAsia="Times New Roman" w:hAnsi="Times New Roman" w:cs="Times New Roman"/>
+          <w:b/>
+          <w:bCs/>
+          <w:sz w:val="28"/>
+          <w:szCs w:val="28"/>
+          <w:lang w:eastAsia="ru-RU"/>
+        </w:rPr>
+        <w:t>ПО</w:t>
+      </w:r>
+      <w:r>
+        <w:rPr>
+          <w:rFonts w:ascii="Times New Roman" w:eastAsia="Times New Roman" w:hAnsi="Times New Roman" w:cs="Times New Roman"/>
+          <w:sz w:val="28"/>
+          <w:szCs w:val="28"/>
+          <w:lang w:eastAsia="ru-RU"/>
+        </w:rPr>
+        <w:t xml:space="preserve">, драйверов, а также в высокопроизводительных системах. Владение </w:t>
+      </w:r>
+      <w:r>
+        <w:rPr>
+          <w:rFonts w:ascii="Times New Roman" w:eastAsia="Times New Roman" w:hAnsi="Times New Roman" w:cs="Times New Roman"/>
+          <w:b/>
+          <w:bCs/>
+          <w:sz w:val="28"/>
+          <w:szCs w:val="28"/>
+          <w:lang w:eastAsia="ru-RU"/>
+        </w:rPr>
+        <w:t>C++</w:t>
+      </w:r>
+      <w:r>
+        <w:rPr>
+          <w:rFonts w:ascii="Times New Roman" w:eastAsia="Times New Roman" w:hAnsi="Times New Roman" w:cs="Times New Roman"/>
+          <w:sz w:val="28"/>
+          <w:szCs w:val="28"/>
+          <w:lang w:eastAsia="ru-RU"/>
+        </w:rPr>
+        <w:t xml:space="preserve"> расширяет кругозор школьника и готовит его к профессиональному программированию.</w:t>
+      </w:r>
+    </w:p>
+    <w:p>
+      <w:pPr>
+        <w:spacing w:before="100" w:beforeAutospacing="1" w:after="100" w:afterAutospacing="1" w:line="240" w:lineRule="auto"/>
+        <w:jc w:val="center"/>
+        <w:rPr>
+          <w:rFonts w:ascii="Times New Roman" w:eastAsia="Times New Roman" w:hAnsi="Times New Roman" w:cs="Times New Roman"/>
+          <w:sz w:val="28"/>
+          <w:szCs w:val="28"/>
+          <w:lang w:eastAsia="ru-RU"/>
+        </w:rPr>
+      </w:pPr>
+      <w:r>
+        <w:rPr>
+          <w:rFonts w:ascii="Times New Roman" w:eastAsia="Times New Roman" w:hAnsi="Times New Roman" w:cs="Times New Roman"/>
+          <w:b/>
+          <w:bCs/>
+          <w:sz w:val="28"/>
+          <w:szCs w:val="28"/>
+          <w:lang w:eastAsia="ru-RU"/>
+        </w:rPr>
+        <w:t>Совместимость с экзаменационными задачами</w:t>
+      </w:r>
+    </w:p>
+    <w:p>
+      <w:pPr>
+        <w:spacing w:before="100" w:beforeAutospacing="1" w:after="100" w:afterAutospacing="1" w:line="240" w:lineRule="auto"/>
+        <w:rPr>
+          <w:rFonts w:ascii="Times New Roman" w:eastAsia="Times New Roman" w:hAnsi="Times New Roman" w:cs="Times New Roman"/>
+          <w:sz w:val="28"/>
+          <w:szCs w:val="28"/>
+          <w:lang w:eastAsia="ru-RU"/>
+        </w:rPr>
+      </w:pPr>
+      <w:r>
+        <w:rPr>
+          <w:rFonts w:ascii="Times New Roman" w:eastAsia="Times New Roman" w:hAnsi="Times New Roman" w:cs="Times New Roman"/>
+          <w:sz w:val="28"/>
+          <w:szCs w:val="28"/>
+          <w:lang w:eastAsia="ru-RU"/>
+        </w:rPr>
+        <w:t xml:space="preserve">На </w:t>
+      </w:r>
+      <w:r>
+        <w:rPr>
+          <w:rFonts w:ascii="Times New Roman" w:eastAsia="Times New Roman" w:hAnsi="Times New Roman" w:cs="Times New Roman"/>
+          <w:b/>
+          <w:bCs/>
+          <w:sz w:val="28"/>
+          <w:szCs w:val="28"/>
+          <w:lang w:eastAsia="ru-RU"/>
+        </w:rPr>
+        <w:t>ОГЭ</w:t>
+      </w:r>
+      <w:r>
+        <w:rPr>
+          <w:rFonts w:ascii="Times New Roman" w:eastAsia="Times New Roman" w:hAnsi="Times New Roman" w:cs="Times New Roman"/>
+          <w:sz w:val="28"/>
+          <w:szCs w:val="28"/>
+          <w:lang w:eastAsia="ru-RU"/>
+        </w:rPr>
+        <w:t xml:space="preserve"> допускается использование </w:t>
+      </w:r>
+      <w:r>
+        <w:rPr>
+          <w:rFonts w:ascii="Times New Roman" w:eastAsia="Times New Roman" w:hAnsi="Times New Roman" w:cs="Times New Roman"/>
+          <w:b/>
+          <w:bCs/>
+          <w:sz w:val="28"/>
+          <w:szCs w:val="28"/>
+          <w:lang w:eastAsia="ru-RU"/>
+        </w:rPr>
+        <w:t>C++</w:t>
+      </w:r>
+      <w:r>
+        <w:rPr>
+          <w:rFonts w:ascii="Times New Roman" w:eastAsia="Times New Roman" w:hAnsi="Times New Roman" w:cs="Times New Roman"/>
+          <w:sz w:val="28"/>
+          <w:szCs w:val="28"/>
+          <w:lang w:eastAsia="ru-RU"/>
+        </w:rPr>
+        <w:t xml:space="preserve">, и его возможностей достаточно для решения всех типов заданий: работа с циклами, условиями, массивами, строками и файлами. Несмотря на большую строгость по сравнению с </w:t>
+      </w:r>
+      <w:r>
+        <w:rPr>
+          <w:rFonts w:ascii="Times New Roman" w:eastAsia="Times New Roman" w:hAnsi="Times New Roman" w:cs="Times New Roman"/>
+          <w:b/>
+          <w:bCs/>
+          <w:sz w:val="28"/>
+          <w:szCs w:val="28"/>
+          <w:lang w:eastAsia="ru-RU"/>
+        </w:rPr>
+        <w:t>Python</w:t>
+      </w:r>
+      <w:r>
+        <w:rPr>
+          <w:rFonts w:ascii="Times New Roman" w:eastAsia="Times New Roman" w:hAnsi="Times New Roman" w:cs="Times New Roman"/>
+          <w:sz w:val="28"/>
+          <w:szCs w:val="28"/>
+          <w:lang w:eastAsia="ru-RU"/>
+        </w:rPr>
+        <w:t xml:space="preserve">, </w:t>
+      </w:r>
+      <w:r>
+        <w:rPr>
+          <w:rFonts w:ascii="Times New Roman" w:eastAsia="Times New Roman" w:hAnsi="Times New Roman" w:cs="Times New Roman"/>
+          <w:b/>
+          <w:bCs/>
+          <w:sz w:val="28"/>
+          <w:szCs w:val="28"/>
+          <w:lang w:eastAsia="ru-RU"/>
+        </w:rPr>
+        <w:t>C++</w:t>
+      </w:r>
+      <w:r>
+        <w:rPr>
+          <w:rFonts w:ascii="Times New Roman" w:eastAsia="Times New Roman" w:hAnsi="Times New Roman" w:cs="Times New Roman"/>
+          <w:sz w:val="28"/>
+          <w:szCs w:val="28"/>
+          <w:lang w:eastAsia="ru-RU"/>
+        </w:rPr>
+        <w:t xml:space="preserve"> даёт более точное представление об алгоритмах и логике их реализации.</w:t>
+      </w:r>
+    </w:p>
+    <w:p>
+      <w:pPr>
+        <w:spacing w:before="100" w:beforeAutospacing="1" w:after="100" w:afterAutospacing="1" w:line="240" w:lineRule="auto"/>
+        <w:jc w:val="center"/>
+        <w:rPr>
+          <w:rFonts w:ascii="Times New Roman" w:eastAsia="Times New Roman" w:hAnsi="Times New Roman" w:cs="Times New Roman"/>
+          <w:sz w:val="28"/>
+          <w:szCs w:val="28"/>
+          <w:lang w:eastAsia="ru-RU"/>
+        </w:rPr>
+      </w:pPr>
+      <w:r>
+        <w:rPr>
+          <w:rFonts w:ascii="Times New Roman" w:eastAsia="Times New Roman" w:hAnsi="Times New Roman" w:cs="Times New Roman"/>
+          <w:b/>
+          <w:bCs/>
+          <w:sz w:val="28"/>
+          <w:szCs w:val="28"/>
+          <w:lang w:eastAsia="ru-RU"/>
+        </w:rPr>
+        <w:t>Пример решения задачи на C++</w:t>
+      </w:r>
+    </w:p>
+    <w:p>
+      <w:pPr>
+        <w:spacing w:before="100" w:beforeAutospacing="1" w:after="100" w:afterAutospacing="1" w:line="240" w:lineRule="auto"/>
+        <w:rPr>
+          <w:rFonts w:ascii="Times New Roman" w:eastAsia="Times New Roman" w:hAnsi="Times New Roman" w:cs="Times New Roman"/>
+          <w:sz w:val="28"/>
+          <w:szCs w:val="28"/>
+          <w:lang w:eastAsia="ru-RU"/>
+        </w:rPr>
+      </w:pPr>
+      <w:r>
+        <w:rPr>
+          <w:rFonts w:ascii="Times New Roman" w:eastAsia="Times New Roman" w:hAnsi="Times New Roman" w:cs="Times New Roman"/>
+          <w:b/>
+          <w:bCs/>
+          <w:sz w:val="28"/>
+          <w:szCs w:val="28"/>
+          <w:lang w:eastAsia="ru-RU"/>
+        </w:rPr>
+        <w:t>Задача:</w:t>
+      </w:r>
+    </w:p>
+    <w:p>
+      <w:pPr>
+        <w:spacing w:before="100" w:beforeAutospacing="1" w:after="100" w:afterAutospacing="1" w:line="240" w:lineRule="auto"/>
+        <w:rPr>
+          <w:rFonts w:ascii="Times New Roman" w:eastAsia="Times New Roman" w:hAnsi="Times New Roman" w:cs="Times New Roman"/>
+          <w:sz w:val="28"/>
+          <w:szCs w:val="28"/>
+          <w:lang w:eastAsia="ru-RU"/>
+        </w:rPr>
+      </w:pPr>
+      <w:r>
+        <w:rPr>
+          <w:rFonts w:ascii="Times New Roman" w:eastAsia="Times New Roman" w:hAnsi="Times New Roman" w:cs="Times New Roman"/>
+          <w:sz w:val="28"/>
+          <w:szCs w:val="28"/>
+          <w:lang w:eastAsia="ru-RU"/>
+        </w:rPr>
+        <w:t>Дан список целых чисел {10, 20, 30, 40, 50} и число X = 35. Подсчитайте количество элементов больше X.</w:t>
+      </w:r>
+    </w:p>
+    <w:p>
+      <w:pPr>
+        <w:spacing w:before="100" w:beforeAutospacing="1" w:after="100" w:afterAutospacing="1" w:line="240" w:lineRule="auto"/>
+        <w:rPr>
+          <w:rFonts w:ascii="Times New Roman" w:eastAsia="Times New Roman" w:hAnsi="Times New Roman" w:cs="Times New Roman"/>
+          <w:sz w:val="28"/>
+          <w:szCs w:val="28"/>
           <w:lang w:val="en-US" w:eastAsia="ru-RU"/>
         </w:rPr>
       </w:pPr>
       <w:r>
         <w:rPr>
           <w:rFonts w:ascii="Times New Roman" w:eastAsia="Times New Roman" w:hAnsi="Times New Roman" w:cs="Times New Roman"/>
-          <w:color w:val="000088"/>
-          <w:sz w:val="28"/>
-          <w:szCs w:val="28"/>
-          <w:shd w:val="clear" w:color="auto" w:fill="F3F4F6"/>
+          <w:b/>
+          <w:bCs/>
+          <w:sz w:val="28"/>
+          <w:szCs w:val="28"/>
+          <w:lang w:eastAsia="ru-RU"/>
+        </w:rPr>
+        <w:t>Решение</w:t>
+      </w:r>
+      <w:r>
+        <w:rPr>
+          <w:rFonts w:ascii="Times New Roman" w:eastAsia="Times New Roman" w:hAnsi="Times New Roman" w:cs="Times New Roman"/>
+          <w:b/>
+          <w:bCs/>
+          <w:sz w:val="28"/>
+          <w:szCs w:val="28"/>
           <w:lang w:val="en-US" w:eastAsia="ru-RU"/>
         </w:rPr>
-        <w:t>using</w:t>
-      </w:r>
-      <w:r>
-        <w:rPr>
-          <w:rFonts w:ascii="Times New Roman" w:eastAsia="Times New Roman" w:hAnsi="Times New Roman" w:cs="Times New Roman"/>
-          <w:color w:val="000000"/>
-          <w:sz w:val="28"/>
-          <w:szCs w:val="28"/>
-          <w:shd w:val="clear" w:color="auto" w:fill="F3F4F6"/>
+        <w:t xml:space="preserve"> </w:t>
+      </w:r>
+      <w:r>
+        <w:rPr>
+          <w:rFonts w:ascii="Times New Roman" w:eastAsia="Times New Roman" w:hAnsi="Times New Roman" w:cs="Times New Roman"/>
+          <w:b/>
+          <w:bCs/>
+          <w:sz w:val="28"/>
+          <w:szCs w:val="28"/>
+          <w:lang w:eastAsia="ru-RU"/>
+        </w:rPr>
+        <w:t>на</w:t>
+      </w:r>
+      <w:r>
+        <w:rPr>
+          <w:rFonts w:ascii="Times New Roman" w:eastAsia="Times New Roman" w:hAnsi="Times New Roman" w:cs="Times New Roman"/>
+          <w:b/>
+          <w:bCs/>
+          <w:sz w:val="28"/>
+          <w:szCs w:val="28"/>
           <w:lang w:val="en-US" w:eastAsia="ru-RU"/>
         </w:rPr>
-        <w:t xml:space="preserve"> </w:t>
-      </w:r>
-      <w:r>
-        <w:rPr>
-          <w:rFonts w:ascii="Times New Roman" w:eastAsia="Times New Roman" w:hAnsi="Times New Roman" w:cs="Times New Roman"/>
-          <w:color w:val="000088"/>
-          <w:sz w:val="28"/>
-          <w:szCs w:val="28"/>
-          <w:shd w:val="clear" w:color="auto" w:fill="F3F4F6"/>
-          <w:lang w:val="en-US" w:eastAsia="ru-RU"/>
-        </w:rPr>
-        <w:t>namespace</w:t>
-      </w:r>
-      <w:r>
-        <w:rPr>
-          <w:rFonts w:ascii="Times New Roman" w:eastAsia="Times New Roman" w:hAnsi="Times New Roman" w:cs="Times New Roman"/>
-          <w:color w:val="000000"/>
-          <w:sz w:val="28"/>
-          <w:szCs w:val="28"/>
-          <w:shd w:val="clear" w:color="auto" w:fill="F3F4F6"/>
-          <w:lang w:val="en-US" w:eastAsia="ru-RU"/>
-        </w:rPr>
-        <w:t xml:space="preserve"> std;</w:t>
-      </w:r>
-    </w:p>
-    <w:p>
-      <w:pPr>
-        <w:shd w:val="clear" w:color="auto" w:fill="FFFFFF"/>
+        <w:t xml:space="preserve"> C++:</w:t>
+      </w:r>
+    </w:p>
+    <w:p>
+      <w:pPr>
         <w:tabs>
           <w:tab w:val="left" w:pos="916"/>
           <w:tab w:val="left" w:pos="1832"/>
@@ -5919,64 +5657,26 @@
           <w:tab w:val="left" w:pos="13740"/>
           <w:tab w:val="left" w:pos="14656"/>
         </w:tabs>
-        <w:spacing w:before="240" w:after="240" w:line="312" w:lineRule="atLeast"/>
-        <w:rPr>
-          <w:rFonts w:ascii="Times New Roman" w:eastAsia="Times New Roman" w:hAnsi="Times New Roman" w:cs="Times New Roman"/>
-          <w:color w:val="000000"/>
-          <w:sz w:val="28"/>
-          <w:szCs w:val="28"/>
-          <w:shd w:val="clear" w:color="auto" w:fill="F3F4F6"/>
+        <w:spacing w:after="0" w:line="240" w:lineRule="auto"/>
+        <w:rPr>
+          <w:rFonts w:ascii="Times New Roman" w:eastAsia="Times New Roman" w:hAnsi="Times New Roman" w:cs="Times New Roman"/>
+          <w:sz w:val="28"/>
+          <w:szCs w:val="28"/>
           <w:lang w:val="en-US" w:eastAsia="ru-RU"/>
         </w:rPr>
       </w:pPr>
       <w:r>
         <w:rPr>
           <w:rFonts w:ascii="Times New Roman" w:eastAsia="Times New Roman" w:hAnsi="Times New Roman" w:cs="Times New Roman"/>
-          <w:color w:val="660066"/>
-          <w:sz w:val="28"/>
-          <w:szCs w:val="28"/>
-          <w:shd w:val="clear" w:color="auto" w:fill="F3F4F6"/>
+          <w:sz w:val="28"/>
+          <w:szCs w:val="28"/>
           <w:lang w:val="en-US" w:eastAsia="ru-RU"/>
         </w:rPr>
-        <w:t>int</w:t>
-      </w:r>
-      <w:r>
-        <w:rPr>
-          <w:rFonts w:ascii="Times New Roman" w:eastAsia="Times New Roman" w:hAnsi="Times New Roman" w:cs="Times New Roman"/>
-          <w:color w:val="000000"/>
-          <w:sz w:val="28"/>
-          <w:szCs w:val="28"/>
-          <w:shd w:val="clear" w:color="auto" w:fill="F3F4F6"/>
-          <w:lang w:val="en-US" w:eastAsia="ru-RU"/>
-        </w:rPr>
-        <w:t xml:space="preserve"> </w:t>
-      </w:r>
-      <w:r>
-        <w:rPr>
-          <w:rFonts w:ascii="Times New Roman" w:eastAsia="Times New Roman" w:hAnsi="Times New Roman" w:cs="Times New Roman"/>
-          <w:color w:val="660066"/>
-          <w:sz w:val="28"/>
-          <w:szCs w:val="28"/>
-          <w:shd w:val="clear" w:color="auto" w:fill="F3F4F6"/>
-          <w:lang w:val="en-US" w:eastAsia="ru-RU"/>
-        </w:rPr>
-        <w:t>main()</w:t>
-      </w:r>
-      <w:r>
-        <w:rPr>
-          <w:rFonts w:ascii="Times New Roman" w:eastAsia="Times New Roman" w:hAnsi="Times New Roman" w:cs="Times New Roman"/>
-          <w:color w:val="000000"/>
-          <w:sz w:val="28"/>
-          <w:szCs w:val="28"/>
-          <w:shd w:val="clear" w:color="auto" w:fill="F3F4F6"/>
-          <w:lang w:val="en-US" w:eastAsia="ru-RU"/>
-        </w:rPr>
-        <w:t xml:space="preserve"> {</w:t>
-      </w:r>
-    </w:p>
-    <w:p>
-      <w:pPr>
-        <w:shd w:val="clear" w:color="auto" w:fill="FFFFFF"/>
+        <w:t>#include &lt;iostream&gt;</w:t>
+      </w:r>
+    </w:p>
+    <w:p>
+      <w:pPr>
         <w:tabs>
           <w:tab w:val="left" w:pos="916"/>
           <w:tab w:val="left" w:pos="1832"/>
@@ -5995,163 +5695,26 @@
           <w:tab w:val="left" w:pos="13740"/>
           <w:tab w:val="left" w:pos="14656"/>
         </w:tabs>
-        <w:spacing w:before="240" w:after="240" w:line="312" w:lineRule="atLeast"/>
-        <w:rPr>
-          <w:rFonts w:ascii="Times New Roman" w:eastAsia="Times New Roman" w:hAnsi="Times New Roman" w:cs="Times New Roman"/>
-          <w:color w:val="000000"/>
-          <w:sz w:val="28"/>
-          <w:szCs w:val="28"/>
-          <w:shd w:val="clear" w:color="auto" w:fill="F3F4F6"/>
+        <w:spacing w:after="0" w:line="240" w:lineRule="auto"/>
+        <w:rPr>
+          <w:rFonts w:ascii="Times New Roman" w:eastAsia="Times New Roman" w:hAnsi="Times New Roman" w:cs="Times New Roman"/>
+          <w:sz w:val="28"/>
+          <w:szCs w:val="28"/>
           <w:lang w:val="en-US" w:eastAsia="ru-RU"/>
         </w:rPr>
       </w:pPr>
       <w:r>
         <w:rPr>
           <w:rFonts w:ascii="Times New Roman" w:eastAsia="Times New Roman" w:hAnsi="Times New Roman" w:cs="Times New Roman"/>
-          <w:color w:val="000000"/>
-          <w:sz w:val="28"/>
-          <w:szCs w:val="28"/>
-          <w:shd w:val="clear" w:color="auto" w:fill="F3F4F6"/>
+          <w:sz w:val="28"/>
+          <w:szCs w:val="28"/>
           <w:lang w:val="en-US" w:eastAsia="ru-RU"/>
         </w:rPr>
-        <w:t xml:space="preserve">    </w:t>
-      </w:r>
-      <w:r>
-        <w:rPr>
-          <w:rFonts w:ascii="Times New Roman" w:eastAsia="Times New Roman" w:hAnsi="Times New Roman" w:cs="Times New Roman"/>
-          <w:color w:val="660066"/>
-          <w:sz w:val="28"/>
-          <w:szCs w:val="28"/>
-          <w:shd w:val="clear" w:color="auto" w:fill="F3F4F6"/>
-          <w:lang w:val="en-US" w:eastAsia="ru-RU"/>
-        </w:rPr>
-        <w:t>int</w:t>
-      </w:r>
-      <w:r>
-        <w:rPr>
-          <w:rFonts w:ascii="Times New Roman" w:eastAsia="Times New Roman" w:hAnsi="Times New Roman" w:cs="Times New Roman"/>
-          <w:color w:val="000000"/>
-          <w:sz w:val="28"/>
-          <w:szCs w:val="28"/>
-          <w:shd w:val="clear" w:color="auto" w:fill="F3F4F6"/>
-          <w:lang w:val="en-US" w:eastAsia="ru-RU"/>
-        </w:rPr>
-        <w:t xml:space="preserve"> arr[] = {</w:t>
-      </w:r>
-      <w:r>
-        <w:rPr>
-          <w:rFonts w:ascii="Times New Roman" w:eastAsia="Times New Roman" w:hAnsi="Times New Roman" w:cs="Times New Roman"/>
-          <w:color w:val="006666"/>
-          <w:sz w:val="28"/>
-          <w:szCs w:val="28"/>
-          <w:shd w:val="clear" w:color="auto" w:fill="F3F4F6"/>
-          <w:lang w:val="en-US" w:eastAsia="ru-RU"/>
-        </w:rPr>
-        <w:t>10</w:t>
-      </w:r>
-      <w:r>
-        <w:rPr>
-          <w:rFonts w:ascii="Times New Roman" w:eastAsia="Times New Roman" w:hAnsi="Times New Roman" w:cs="Times New Roman"/>
-          <w:color w:val="000000"/>
-          <w:sz w:val="28"/>
-          <w:szCs w:val="28"/>
-          <w:shd w:val="clear" w:color="auto" w:fill="F3F4F6"/>
-          <w:lang w:val="en-US" w:eastAsia="ru-RU"/>
-        </w:rPr>
-        <w:t xml:space="preserve">, </w:t>
-      </w:r>
-      <w:r>
-        <w:rPr>
-          <w:rFonts w:ascii="Times New Roman" w:eastAsia="Times New Roman" w:hAnsi="Times New Roman" w:cs="Times New Roman"/>
-          <w:color w:val="006666"/>
-          <w:sz w:val="28"/>
-          <w:szCs w:val="28"/>
-          <w:shd w:val="clear" w:color="auto" w:fill="F3F4F6"/>
-          <w:lang w:val="en-US" w:eastAsia="ru-RU"/>
-        </w:rPr>
-        <w:t>20</w:t>
-      </w:r>
-      <w:r>
-        <w:rPr>
-          <w:rFonts w:ascii="Times New Roman" w:eastAsia="Times New Roman" w:hAnsi="Times New Roman" w:cs="Times New Roman"/>
-          <w:color w:val="000000"/>
-          <w:sz w:val="28"/>
-          <w:szCs w:val="28"/>
-          <w:shd w:val="clear" w:color="auto" w:fill="F3F4F6"/>
-          <w:lang w:val="en-US" w:eastAsia="ru-RU"/>
-        </w:rPr>
-        <w:t xml:space="preserve">, </w:t>
-      </w:r>
-      <w:r>
-        <w:rPr>
-          <w:rFonts w:ascii="Times New Roman" w:eastAsia="Times New Roman" w:hAnsi="Times New Roman" w:cs="Times New Roman"/>
-          <w:color w:val="006666"/>
-          <w:sz w:val="28"/>
-          <w:szCs w:val="28"/>
-          <w:shd w:val="clear" w:color="auto" w:fill="F3F4F6"/>
-          <w:lang w:val="en-US" w:eastAsia="ru-RU"/>
-        </w:rPr>
-        <w:t>30</w:t>
-      </w:r>
-      <w:r>
-        <w:rPr>
-          <w:rFonts w:ascii="Times New Roman" w:eastAsia="Times New Roman" w:hAnsi="Times New Roman" w:cs="Times New Roman"/>
-          <w:color w:val="000000"/>
-          <w:sz w:val="28"/>
-          <w:szCs w:val="28"/>
-          <w:shd w:val="clear" w:color="auto" w:fill="F3F4F6"/>
-          <w:lang w:val="en-US" w:eastAsia="ru-RU"/>
-        </w:rPr>
-        <w:t xml:space="preserve">, </w:t>
-      </w:r>
-      <w:r>
-        <w:rPr>
-          <w:rFonts w:ascii="Times New Roman" w:eastAsia="Times New Roman" w:hAnsi="Times New Roman" w:cs="Times New Roman"/>
-          <w:color w:val="006666"/>
-          <w:sz w:val="28"/>
-          <w:szCs w:val="28"/>
-          <w:shd w:val="clear" w:color="auto" w:fill="F3F4F6"/>
-          <w:lang w:val="en-US" w:eastAsia="ru-RU"/>
-        </w:rPr>
-        <w:t>40</w:t>
-      </w:r>
-      <w:r>
-        <w:rPr>
-          <w:rFonts w:ascii="Times New Roman" w:eastAsia="Times New Roman" w:hAnsi="Times New Roman" w:cs="Times New Roman"/>
-          <w:color w:val="000000"/>
-          <w:sz w:val="28"/>
-          <w:szCs w:val="28"/>
-          <w:shd w:val="clear" w:color="auto" w:fill="F3F4F6"/>
-          <w:lang w:val="en-US" w:eastAsia="ru-RU"/>
-        </w:rPr>
-        <w:t xml:space="preserve">, </w:t>
-      </w:r>
-      <w:r>
-        <w:rPr>
-          <w:rFonts w:ascii="Times New Roman" w:eastAsia="Times New Roman" w:hAnsi="Times New Roman" w:cs="Times New Roman"/>
-          <w:color w:val="006666"/>
-          <w:sz w:val="28"/>
-          <w:szCs w:val="28"/>
-          <w:shd w:val="clear" w:color="auto" w:fill="F3F4F6"/>
-          <w:lang w:val="en-US" w:eastAsia="ru-RU"/>
-        </w:rPr>
-        <w:t>50</w:t>
-      </w:r>
-      <w:r>
-        <w:rPr>
-          <w:rFonts w:ascii="Times New Roman" w:eastAsia="Times New Roman" w:hAnsi="Times New Roman" w:cs="Times New Roman"/>
-          <w:color w:val="000000"/>
-          <w:sz w:val="28"/>
-          <w:szCs w:val="28"/>
-          <w:shd w:val="clear" w:color="auto" w:fill="F3F4F6"/>
-          <w:lang w:val="en-US" w:eastAsia="ru-RU"/>
-        </w:rPr>
-        <w:t>};</w:t>
-      </w:r>
-    </w:p>
-    <w:p>
-      <w:pPr>
-        <w:shd w:val="clear" w:color="auto" w:fill="FFFFFF"/>
+        <w:t>using namespace std;</w:t>
+      </w:r>
+    </w:p>
+    <w:p>
+      <w:pPr>
         <w:tabs>
           <w:tab w:val="left" w:pos="916"/>
           <w:tab w:val="left" w:pos="1832"/>
@@ -6170,75 +5733,17 @@
           <w:tab w:val="left" w:pos="13740"/>
           <w:tab w:val="left" w:pos="14656"/>
         </w:tabs>
-        <w:spacing w:before="240" w:after="240" w:line="312" w:lineRule="atLeast"/>
-        <w:rPr>
-          <w:rFonts w:ascii="Times New Roman" w:eastAsia="Times New Roman" w:hAnsi="Times New Roman" w:cs="Times New Roman"/>
-          <w:color w:val="000000"/>
-          <w:sz w:val="28"/>
-          <w:szCs w:val="28"/>
-          <w:shd w:val="clear" w:color="auto" w:fill="F3F4F6"/>
+        <w:spacing w:after="0" w:line="240" w:lineRule="auto"/>
+        <w:rPr>
+          <w:rFonts w:ascii="Times New Roman" w:eastAsia="Times New Roman" w:hAnsi="Times New Roman" w:cs="Times New Roman"/>
+          <w:sz w:val="28"/>
+          <w:szCs w:val="28"/>
           <w:lang w:val="en-US" w:eastAsia="ru-RU"/>
         </w:rPr>
       </w:pPr>
-      <w:r>
-        <w:rPr>
-          <w:rFonts w:ascii="Times New Roman" w:eastAsia="Times New Roman" w:hAnsi="Times New Roman" w:cs="Times New Roman"/>
-          <w:color w:val="000000"/>
-          <w:sz w:val="28"/>
-          <w:szCs w:val="28"/>
-          <w:shd w:val="clear" w:color="auto" w:fill="F3F4F6"/>
-          <w:lang w:val="en-US" w:eastAsia="ru-RU"/>
-        </w:rPr>
-        <w:t xml:space="preserve">    </w:t>
-      </w:r>
-      <w:r>
-        <w:rPr>
-          <w:rFonts w:ascii="Times New Roman" w:eastAsia="Times New Roman" w:hAnsi="Times New Roman" w:cs="Times New Roman"/>
-          <w:color w:val="660066"/>
-          <w:sz w:val="28"/>
-          <w:szCs w:val="28"/>
-          <w:shd w:val="clear" w:color="auto" w:fill="F3F4F6"/>
-          <w:lang w:val="en-US" w:eastAsia="ru-RU"/>
-        </w:rPr>
-        <w:t>int</w:t>
-      </w:r>
-      <w:r>
-        <w:rPr>
-          <w:rFonts w:ascii="Times New Roman" w:eastAsia="Times New Roman" w:hAnsi="Times New Roman" w:cs="Times New Roman"/>
-          <w:color w:val="000000"/>
-          <w:sz w:val="28"/>
-          <w:szCs w:val="28"/>
-          <w:shd w:val="clear" w:color="auto" w:fill="F3F4F6"/>
-          <w:lang w:val="en-US" w:eastAsia="ru-RU"/>
-        </w:rPr>
-        <w:t xml:space="preserve"> x = </w:t>
-      </w:r>
-      <w:r>
-        <w:rPr>
-          <w:rFonts w:ascii="Times New Roman" w:eastAsia="Times New Roman" w:hAnsi="Times New Roman" w:cs="Times New Roman"/>
-          <w:color w:val="006666"/>
-          <w:sz w:val="28"/>
-          <w:szCs w:val="28"/>
-          <w:shd w:val="clear" w:color="auto" w:fill="F3F4F6"/>
-          <w:lang w:val="en-US" w:eastAsia="ru-RU"/>
-        </w:rPr>
-        <w:t>35</w:t>
-      </w:r>
-      <w:r>
-        <w:rPr>
-          <w:rFonts w:ascii="Times New Roman" w:eastAsia="Times New Roman" w:hAnsi="Times New Roman" w:cs="Times New Roman"/>
-          <w:color w:val="000000"/>
-          <w:sz w:val="28"/>
-          <w:szCs w:val="28"/>
-          <w:shd w:val="clear" w:color="auto" w:fill="F3F4F6"/>
-          <w:lang w:val="en-US" w:eastAsia="ru-RU"/>
-        </w:rPr>
-        <w:t>;</w:t>
-      </w:r>
-    </w:p>
-    <w:p>
-      <w:pPr>
-        <w:shd w:val="clear" w:color="auto" w:fill="FFFFFF"/>
+    </w:p>
+    <w:p>
+      <w:pPr>
         <w:tabs>
           <w:tab w:val="left" w:pos="916"/>
           <w:tab w:val="left" w:pos="1832"/>
@@ -6257,75 +5762,26 @@
           <w:tab w:val="left" w:pos="13740"/>
           <w:tab w:val="left" w:pos="14656"/>
         </w:tabs>
-        <w:spacing w:before="240" w:after="240" w:line="312" w:lineRule="atLeast"/>
-        <w:rPr>
-          <w:rFonts w:ascii="Times New Roman" w:eastAsia="Times New Roman" w:hAnsi="Times New Roman" w:cs="Times New Roman"/>
-          <w:color w:val="000000"/>
-          <w:sz w:val="28"/>
-          <w:szCs w:val="28"/>
-          <w:shd w:val="clear" w:color="auto" w:fill="F3F4F6"/>
+        <w:spacing w:after="0" w:line="240" w:lineRule="auto"/>
+        <w:rPr>
+          <w:rFonts w:ascii="Times New Roman" w:eastAsia="Times New Roman" w:hAnsi="Times New Roman" w:cs="Times New Roman"/>
+          <w:sz w:val="28"/>
+          <w:szCs w:val="28"/>
           <w:lang w:val="en-US" w:eastAsia="ru-RU"/>
         </w:rPr>
       </w:pPr>
       <w:r>
         <w:rPr>
           <w:rFonts w:ascii="Times New Roman" w:eastAsia="Times New Roman" w:hAnsi="Times New Roman" w:cs="Times New Roman"/>
-          <w:color w:val="000000"/>
-          <w:sz w:val="28"/>
-          <w:szCs w:val="28"/>
-          <w:shd w:val="clear" w:color="auto" w:fill="F3F4F6"/>
+          <w:sz w:val="28"/>
+          <w:szCs w:val="28"/>
           <w:lang w:val="en-US" w:eastAsia="ru-RU"/>
         </w:rPr>
-        <w:t xml:space="preserve">    </w:t>
-      </w:r>
-      <w:r>
-        <w:rPr>
-          <w:rFonts w:ascii="Times New Roman" w:eastAsia="Times New Roman" w:hAnsi="Times New Roman" w:cs="Times New Roman"/>
-          <w:color w:val="660066"/>
-          <w:sz w:val="28"/>
-          <w:szCs w:val="28"/>
-          <w:shd w:val="clear" w:color="auto" w:fill="F3F4F6"/>
-          <w:lang w:val="en-US" w:eastAsia="ru-RU"/>
-        </w:rPr>
-        <w:t>int</w:t>
-      </w:r>
-      <w:r>
-        <w:rPr>
-          <w:rFonts w:ascii="Times New Roman" w:eastAsia="Times New Roman" w:hAnsi="Times New Roman" w:cs="Times New Roman"/>
-          <w:color w:val="000000"/>
-          <w:sz w:val="28"/>
-          <w:szCs w:val="28"/>
-          <w:shd w:val="clear" w:color="auto" w:fill="F3F4F6"/>
-          <w:lang w:val="en-US" w:eastAsia="ru-RU"/>
-        </w:rPr>
-        <w:t xml:space="preserve"> count = </w:t>
-      </w:r>
-      <w:r>
-        <w:rPr>
-          <w:rFonts w:ascii="Times New Roman" w:eastAsia="Times New Roman" w:hAnsi="Times New Roman" w:cs="Times New Roman"/>
-          <w:color w:val="006666"/>
-          <w:sz w:val="28"/>
-          <w:szCs w:val="28"/>
-          <w:shd w:val="clear" w:color="auto" w:fill="F3F4F6"/>
-          <w:lang w:val="en-US" w:eastAsia="ru-RU"/>
-        </w:rPr>
-        <w:t>0</w:t>
-      </w:r>
-      <w:r>
-        <w:rPr>
-          <w:rFonts w:ascii="Times New Roman" w:eastAsia="Times New Roman" w:hAnsi="Times New Roman" w:cs="Times New Roman"/>
-          <w:color w:val="000000"/>
-          <w:sz w:val="28"/>
-          <w:szCs w:val="28"/>
-          <w:shd w:val="clear" w:color="auto" w:fill="F3F4F6"/>
-          <w:lang w:val="en-US" w:eastAsia="ru-RU"/>
-        </w:rPr>
-        <w:t>;</w:t>
-      </w:r>
-    </w:p>
-    <w:p>
-      <w:pPr>
-        <w:shd w:val="clear" w:color="auto" w:fill="FFFFFF"/>
+        <w:t>int main() {</w:t>
+      </w:r>
+    </w:p>
+    <w:p>
+      <w:pPr>
         <w:tabs>
           <w:tab w:val="left" w:pos="916"/>
           <w:tab w:val="left" w:pos="1832"/>
@@ -6344,119 +5800,26 @@
           <w:tab w:val="left" w:pos="13740"/>
           <w:tab w:val="left" w:pos="14656"/>
         </w:tabs>
-        <w:spacing w:before="240" w:after="240" w:line="312" w:lineRule="atLeast"/>
-        <w:rPr>
-          <w:rFonts w:ascii="Times New Roman" w:eastAsia="Times New Roman" w:hAnsi="Times New Roman" w:cs="Times New Roman"/>
-          <w:color w:val="000000"/>
-          <w:sz w:val="28"/>
-          <w:szCs w:val="28"/>
-          <w:shd w:val="clear" w:color="auto" w:fill="F3F4F6"/>
+        <w:spacing w:after="0" w:line="240" w:lineRule="auto"/>
+        <w:rPr>
+          <w:rFonts w:ascii="Times New Roman" w:eastAsia="Times New Roman" w:hAnsi="Times New Roman" w:cs="Times New Roman"/>
+          <w:sz w:val="28"/>
+          <w:szCs w:val="28"/>
           <w:lang w:val="en-US" w:eastAsia="ru-RU"/>
         </w:rPr>
       </w:pPr>
       <w:r>
         <w:rPr>
           <w:rFonts w:ascii="Times New Roman" w:eastAsia="Times New Roman" w:hAnsi="Times New Roman" w:cs="Times New Roman"/>
-          <w:color w:val="000000"/>
-          <w:sz w:val="28"/>
-          <w:szCs w:val="28"/>
-          <w:shd w:val="clear" w:color="auto" w:fill="F3F4F6"/>
+          <w:sz w:val="28"/>
+          <w:szCs w:val="28"/>
           <w:lang w:val="en-US" w:eastAsia="ru-RU"/>
         </w:rPr>
-        <w:t xml:space="preserve">    </w:t>
-      </w:r>
-      <w:r>
-        <w:rPr>
-          <w:rFonts w:ascii="Times New Roman" w:eastAsia="Times New Roman" w:hAnsi="Times New Roman" w:cs="Times New Roman"/>
-          <w:color w:val="000088"/>
-          <w:sz w:val="28"/>
-          <w:szCs w:val="28"/>
-          <w:shd w:val="clear" w:color="auto" w:fill="F3F4F6"/>
-          <w:lang w:val="en-US" w:eastAsia="ru-RU"/>
-        </w:rPr>
-        <w:t>for</w:t>
-      </w:r>
-      <w:r>
-        <w:rPr>
-          <w:rFonts w:ascii="Times New Roman" w:eastAsia="Times New Roman" w:hAnsi="Times New Roman" w:cs="Times New Roman"/>
-          <w:color w:val="000000"/>
-          <w:sz w:val="28"/>
-          <w:szCs w:val="28"/>
-          <w:shd w:val="clear" w:color="auto" w:fill="F3F4F6"/>
-          <w:lang w:val="en-US" w:eastAsia="ru-RU"/>
-        </w:rPr>
-        <w:t xml:space="preserve"> (</w:t>
-      </w:r>
-      <w:r>
-        <w:rPr>
-          <w:rFonts w:ascii="Times New Roman" w:eastAsia="Times New Roman" w:hAnsi="Times New Roman" w:cs="Times New Roman"/>
-          <w:color w:val="660066"/>
-          <w:sz w:val="28"/>
-          <w:szCs w:val="28"/>
-          <w:shd w:val="clear" w:color="auto" w:fill="F3F4F6"/>
-          <w:lang w:val="en-US" w:eastAsia="ru-RU"/>
-        </w:rPr>
-        <w:t>int</w:t>
-      </w:r>
-      <w:r>
-        <w:rPr>
-          <w:rFonts w:ascii="Times New Roman" w:eastAsia="Times New Roman" w:hAnsi="Times New Roman" w:cs="Times New Roman"/>
-          <w:color w:val="000000"/>
-          <w:sz w:val="28"/>
-          <w:szCs w:val="28"/>
-          <w:shd w:val="clear" w:color="auto" w:fill="F3F4F6"/>
-          <w:lang w:val="en-US" w:eastAsia="ru-RU"/>
-        </w:rPr>
-        <w:t xml:space="preserve"> i = </w:t>
-      </w:r>
-      <w:r>
-        <w:rPr>
-          <w:rFonts w:ascii="Times New Roman" w:eastAsia="Times New Roman" w:hAnsi="Times New Roman" w:cs="Times New Roman"/>
-          <w:color w:val="006666"/>
-          <w:sz w:val="28"/>
-          <w:szCs w:val="28"/>
-          <w:shd w:val="clear" w:color="auto" w:fill="F3F4F6"/>
-          <w:lang w:val="en-US" w:eastAsia="ru-RU"/>
-        </w:rPr>
-        <w:t>0</w:t>
-      </w:r>
-      <w:r>
-        <w:rPr>
-          <w:rFonts w:ascii="Times New Roman" w:eastAsia="Times New Roman" w:hAnsi="Times New Roman" w:cs="Times New Roman"/>
-          <w:color w:val="000000"/>
-          <w:sz w:val="28"/>
-          <w:szCs w:val="28"/>
-          <w:shd w:val="clear" w:color="auto" w:fill="F3F4F6"/>
-          <w:lang w:val="en-US" w:eastAsia="ru-RU"/>
-        </w:rPr>
-        <w:t xml:space="preserve">; i &lt; </w:t>
-      </w:r>
-      <w:r>
-        <w:rPr>
-          <w:rFonts w:ascii="Times New Roman" w:eastAsia="Times New Roman" w:hAnsi="Times New Roman" w:cs="Times New Roman"/>
-          <w:color w:val="006666"/>
-          <w:sz w:val="28"/>
-          <w:szCs w:val="28"/>
-          <w:shd w:val="clear" w:color="auto" w:fill="F3F4F6"/>
-          <w:lang w:val="en-US" w:eastAsia="ru-RU"/>
-        </w:rPr>
-        <w:t>5</w:t>
-      </w:r>
-      <w:r>
-        <w:rPr>
-          <w:rFonts w:ascii="Times New Roman" w:eastAsia="Times New Roman" w:hAnsi="Times New Roman" w:cs="Times New Roman"/>
-          <w:color w:val="000000"/>
-          <w:sz w:val="28"/>
-          <w:szCs w:val="28"/>
-          <w:shd w:val="clear" w:color="auto" w:fill="F3F4F6"/>
-          <w:lang w:val="en-US" w:eastAsia="ru-RU"/>
-        </w:rPr>
-        <w:t>; i++) {</w:t>
-      </w:r>
-    </w:p>
-    <w:p>
-      <w:pPr>
-        <w:shd w:val="clear" w:color="auto" w:fill="FFFFFF"/>
+        <w:t>    int arr[] = {10, 20, 30, 40, 50};</w:t>
+      </w:r>
+    </w:p>
+    <w:p>
+      <w:pPr>
         <w:tabs>
           <w:tab w:val="left" w:pos="916"/>
           <w:tab w:val="left" w:pos="1832"/>
@@ -6475,53 +5838,26 @@
           <w:tab w:val="left" w:pos="13740"/>
           <w:tab w:val="left" w:pos="14656"/>
         </w:tabs>
-        <w:spacing w:before="240" w:after="240" w:line="312" w:lineRule="atLeast"/>
-        <w:rPr>
-          <w:rFonts w:ascii="Times New Roman" w:eastAsia="Times New Roman" w:hAnsi="Times New Roman" w:cs="Times New Roman"/>
-          <w:color w:val="000000"/>
-          <w:sz w:val="28"/>
-          <w:szCs w:val="28"/>
-          <w:shd w:val="clear" w:color="auto" w:fill="F3F4F6"/>
-          <w:lang w:eastAsia="ru-RU"/>
-        </w:rPr>
-      </w:pPr>
-      <w:r>
-        <w:rPr>
-          <w:rFonts w:ascii="Times New Roman" w:eastAsia="Times New Roman" w:hAnsi="Times New Roman" w:cs="Times New Roman"/>
-          <w:color w:val="000000"/>
-          <w:sz w:val="28"/>
-          <w:szCs w:val="28"/>
-          <w:shd w:val="clear" w:color="auto" w:fill="F3F4F6"/>
+        <w:spacing w:after="0" w:line="240" w:lineRule="auto"/>
+        <w:rPr>
+          <w:rFonts w:ascii="Times New Roman" w:eastAsia="Times New Roman" w:hAnsi="Times New Roman" w:cs="Times New Roman"/>
+          <w:sz w:val="28"/>
+          <w:szCs w:val="28"/>
           <w:lang w:val="en-US" w:eastAsia="ru-RU"/>
         </w:rPr>
-        <w:t xml:space="preserve">        </w:t>
-      </w:r>
-      <w:r>
-        <w:rPr>
-          <w:rFonts w:ascii="Times New Roman" w:eastAsia="Times New Roman" w:hAnsi="Times New Roman" w:cs="Times New Roman"/>
-          <w:color w:val="000088"/>
-          <w:sz w:val="28"/>
-          <w:szCs w:val="28"/>
-          <w:shd w:val="clear" w:color="auto" w:fill="F3F4F6"/>
-          <w:lang w:eastAsia="ru-RU"/>
-        </w:rPr>
-        <w:t>if</w:t>
-      </w:r>
-      <w:r>
-        <w:rPr>
-          <w:rFonts w:ascii="Times New Roman" w:eastAsia="Times New Roman" w:hAnsi="Times New Roman" w:cs="Times New Roman"/>
-          <w:color w:val="000000"/>
-          <w:sz w:val="28"/>
-          <w:szCs w:val="28"/>
-          <w:shd w:val="clear" w:color="auto" w:fill="F3F4F6"/>
-          <w:lang w:eastAsia="ru-RU"/>
-        </w:rPr>
-        <w:t xml:space="preserve"> (arr[i] &gt; x) {</w:t>
-      </w:r>
-    </w:p>
-    <w:p>
-      <w:pPr>
-        <w:shd w:val="clear" w:color="auto" w:fill="FFFFFF"/>
+      </w:pPr>
+      <w:r>
+        <w:rPr>
+          <w:rFonts w:ascii="Times New Roman" w:eastAsia="Times New Roman" w:hAnsi="Times New Roman" w:cs="Times New Roman"/>
+          <w:sz w:val="28"/>
+          <w:szCs w:val="28"/>
+          <w:lang w:val="en-US" w:eastAsia="ru-RU"/>
+        </w:rPr>
+        <w:t>    int x = 35;</w:t>
+      </w:r>
+    </w:p>
+    <w:p>
+      <w:pPr>
         <w:tabs>
           <w:tab w:val="left" w:pos="916"/>
           <w:tab w:val="left" w:pos="1832"/>
@@ -6540,32 +5876,26 @@
           <w:tab w:val="left" w:pos="13740"/>
           <w:tab w:val="left" w:pos="14656"/>
         </w:tabs>
-        <w:spacing w:before="240" w:after="240" w:line="312" w:lineRule="atLeast"/>
-        <w:rPr>
-          <w:rFonts w:ascii="Times New Roman" w:eastAsia="Times New Roman" w:hAnsi="Times New Roman" w:cs="Times New Roman"/>
-          <w:color w:val="000000"/>
-          <w:sz w:val="28"/>
-          <w:szCs w:val="28"/>
-          <w:shd w:val="clear" w:color="auto" w:fill="F3F4F6"/>
+        <w:spacing w:after="0" w:line="240" w:lineRule="auto"/>
+        <w:rPr>
+          <w:rFonts w:ascii="Times New Roman" w:eastAsia="Times New Roman" w:hAnsi="Times New Roman" w:cs="Times New Roman"/>
+          <w:sz w:val="28"/>
+          <w:szCs w:val="28"/>
           <w:lang w:val="en-US" w:eastAsia="ru-RU"/>
         </w:rPr>
       </w:pPr>
       <w:r>
         <w:rPr>
           <w:rFonts w:ascii="Times New Roman" w:eastAsia="Times New Roman" w:hAnsi="Times New Roman" w:cs="Times New Roman"/>
-          <w:color w:val="000000"/>
-          <w:sz w:val="28"/>
-          <w:szCs w:val="28"/>
-          <w:shd w:val="clear" w:color="auto" w:fill="F3F4F6"/>
+          <w:sz w:val="28"/>
+          <w:szCs w:val="28"/>
           <w:lang w:val="en-US" w:eastAsia="ru-RU"/>
         </w:rPr>
-        <w:lastRenderedPageBreak/>
-        <w:t>            count++;</w:t>
-      </w:r>
-    </w:p>
-    <w:p>
-      <w:pPr>
-        <w:shd w:val="clear" w:color="auto" w:fill="FFFFFF"/>
+        <w:t>    int count = 0;</w:t>
+      </w:r>
+    </w:p>
+    <w:p>
+      <w:pPr>
         <w:tabs>
           <w:tab w:val="left" w:pos="916"/>
           <w:tab w:val="left" w:pos="1832"/>
@@ -6584,42 +5914,17 @@
           <w:tab w:val="left" w:pos="13740"/>
           <w:tab w:val="left" w:pos="14656"/>
         </w:tabs>
-        <w:spacing w:before="240" w:after="240" w:line="312" w:lineRule="atLeast"/>
-        <w:rPr>
-          <w:rFonts w:ascii="Times New Roman" w:eastAsia="Times New Roman" w:hAnsi="Times New Roman" w:cs="Times New Roman"/>
-          <w:color w:val="000000"/>
-          <w:sz w:val="28"/>
-          <w:szCs w:val="28"/>
-          <w:shd w:val="clear" w:color="auto" w:fill="F3F4F6"/>
+        <w:spacing w:after="0" w:line="240" w:lineRule="auto"/>
+        <w:rPr>
+          <w:rFonts w:ascii="Times New Roman" w:eastAsia="Times New Roman" w:hAnsi="Times New Roman" w:cs="Times New Roman"/>
+          <w:sz w:val="28"/>
+          <w:szCs w:val="28"/>
           <w:lang w:val="en-US" w:eastAsia="ru-RU"/>
         </w:rPr>
       </w:pPr>
-      <w:r>
-        <w:rPr>
-          <w:rFonts w:ascii="Times New Roman" w:eastAsia="Times New Roman" w:hAnsi="Times New Roman" w:cs="Times New Roman"/>
-          <w:color w:val="000000"/>
-          <w:sz w:val="28"/>
-          <w:szCs w:val="28"/>
-          <w:shd w:val="clear" w:color="auto" w:fill="F3F4F6"/>
-          <w:lang w:val="en-US" w:eastAsia="ru-RU"/>
-        </w:rPr>
-        <w:t xml:space="preserve">      </w:t>
-      </w:r>
-      <w:r>
-        <w:rPr>
-          <w:rFonts w:ascii="Times New Roman" w:eastAsia="Times New Roman" w:hAnsi="Times New Roman" w:cs="Times New Roman"/>
-          <w:color w:val="000000"/>
-          <w:sz w:val="28"/>
-          <w:szCs w:val="28"/>
-          <w:shd w:val="clear" w:color="auto" w:fill="F3F4F6"/>
-          <w:lang w:val="en-US" w:eastAsia="ru-RU"/>
-        </w:rPr>
-        <w:t xml:space="preserve"> }</w:t>
-      </w:r>
-    </w:p>
-    <w:p>
-      <w:pPr>
-        <w:shd w:val="clear" w:color="auto" w:fill="FFFFFF"/>
+    </w:p>
+    <w:p>
+      <w:pPr>
         <w:tabs>
           <w:tab w:val="left" w:pos="916"/>
           <w:tab w:val="left" w:pos="1832"/>
@@ -6638,31 +5943,26 @@
           <w:tab w:val="left" w:pos="13740"/>
           <w:tab w:val="left" w:pos="14656"/>
         </w:tabs>
-        <w:spacing w:before="240" w:after="240" w:line="312" w:lineRule="atLeast"/>
-        <w:rPr>
-          <w:rFonts w:ascii="Times New Roman" w:eastAsia="Times New Roman" w:hAnsi="Times New Roman" w:cs="Times New Roman"/>
-          <w:color w:val="000000"/>
-          <w:sz w:val="28"/>
-          <w:szCs w:val="28"/>
-          <w:shd w:val="clear" w:color="auto" w:fill="F3F4F6"/>
+        <w:spacing w:after="0" w:line="240" w:lineRule="auto"/>
+        <w:rPr>
+          <w:rFonts w:ascii="Times New Roman" w:eastAsia="Times New Roman" w:hAnsi="Times New Roman" w:cs="Times New Roman"/>
+          <w:sz w:val="28"/>
+          <w:szCs w:val="28"/>
           <w:lang w:val="en-US" w:eastAsia="ru-RU"/>
         </w:rPr>
       </w:pPr>
       <w:r>
         <w:rPr>
           <w:rFonts w:ascii="Times New Roman" w:eastAsia="Times New Roman" w:hAnsi="Times New Roman" w:cs="Times New Roman"/>
-          <w:color w:val="000000"/>
-          <w:sz w:val="28"/>
-          <w:szCs w:val="28"/>
-          <w:shd w:val="clear" w:color="auto" w:fill="F3F4F6"/>
+          <w:sz w:val="28"/>
+          <w:szCs w:val="28"/>
           <w:lang w:val="en-US" w:eastAsia="ru-RU"/>
         </w:rPr>
-        <w:t>    }</w:t>
-      </w:r>
-    </w:p>
-    <w:p>
-      <w:pPr>
-        <w:shd w:val="clear" w:color="auto" w:fill="FFFFFF"/>
+        <w:t>    for (int i = 0; i &lt; 5; i++) {</w:t>
+      </w:r>
+    </w:p>
+    <w:p>
+      <w:pPr>
         <w:tabs>
           <w:tab w:val="left" w:pos="916"/>
           <w:tab w:val="left" w:pos="1832"/>
@@ -6681,31 +5981,26 @@
           <w:tab w:val="left" w:pos="13740"/>
           <w:tab w:val="left" w:pos="14656"/>
         </w:tabs>
-        <w:spacing w:before="240" w:after="240" w:line="312" w:lineRule="atLeast"/>
-        <w:rPr>
-          <w:rFonts w:ascii="Times New Roman" w:eastAsia="Times New Roman" w:hAnsi="Times New Roman" w:cs="Times New Roman"/>
-          <w:color w:val="000000"/>
-          <w:sz w:val="28"/>
-          <w:szCs w:val="28"/>
-          <w:shd w:val="clear" w:color="auto" w:fill="F3F4F6"/>
+        <w:spacing w:after="0" w:line="240" w:lineRule="auto"/>
+        <w:rPr>
+          <w:rFonts w:ascii="Times New Roman" w:eastAsia="Times New Roman" w:hAnsi="Times New Roman" w:cs="Times New Roman"/>
+          <w:sz w:val="28"/>
+          <w:szCs w:val="28"/>
           <w:lang w:val="en-US" w:eastAsia="ru-RU"/>
         </w:rPr>
       </w:pPr>
       <w:r>
         <w:rPr>
           <w:rFonts w:ascii="Times New Roman" w:eastAsia="Times New Roman" w:hAnsi="Times New Roman" w:cs="Times New Roman"/>
-          <w:color w:val="000000"/>
-          <w:sz w:val="28"/>
-          <w:szCs w:val="28"/>
-          <w:shd w:val="clear" w:color="auto" w:fill="F3F4F6"/>
+          <w:sz w:val="28"/>
+          <w:szCs w:val="28"/>
           <w:lang w:val="en-US" w:eastAsia="ru-RU"/>
         </w:rPr>
-        <w:t>    cout &lt;&lt; count &lt;&lt; endl;</w:t>
-      </w:r>
-    </w:p>
-    <w:p>
-      <w:pPr>
-        <w:shd w:val="clear" w:color="auto" w:fill="FFFFFF"/>
+        <w:t>        if (arr[i] &gt; x) {</w:t>
+      </w:r>
+    </w:p>
+    <w:p>
+      <w:pPr>
         <w:tabs>
           <w:tab w:val="left" w:pos="916"/>
           <w:tab w:val="left" w:pos="1832"/>
@@ -6724,75 +6019,26 @@
           <w:tab w:val="left" w:pos="13740"/>
           <w:tab w:val="left" w:pos="14656"/>
         </w:tabs>
-        <w:spacing w:before="240" w:after="240" w:line="312" w:lineRule="atLeast"/>
-        <w:rPr>
-          <w:rFonts w:ascii="Times New Roman" w:eastAsia="Times New Roman" w:hAnsi="Times New Roman" w:cs="Times New Roman"/>
-          <w:color w:val="000000"/>
-          <w:sz w:val="28"/>
-          <w:szCs w:val="28"/>
-          <w:shd w:val="clear" w:color="auto" w:fill="F3F4F6"/>
+        <w:spacing w:after="0" w:line="240" w:lineRule="auto"/>
+        <w:rPr>
+          <w:rFonts w:ascii="Times New Roman" w:eastAsia="Times New Roman" w:hAnsi="Times New Roman" w:cs="Times New Roman"/>
+          <w:sz w:val="28"/>
+          <w:szCs w:val="28"/>
           <w:lang w:val="en-US" w:eastAsia="ru-RU"/>
         </w:rPr>
       </w:pPr>
       <w:r>
         <w:rPr>
           <w:rFonts w:ascii="Times New Roman" w:eastAsia="Times New Roman" w:hAnsi="Times New Roman" w:cs="Times New Roman"/>
-          <w:color w:val="000000"/>
-          <w:sz w:val="28"/>
-          <w:szCs w:val="28"/>
-          <w:shd w:val="clear" w:color="auto" w:fill="F3F4F6"/>
+          <w:sz w:val="28"/>
+          <w:szCs w:val="28"/>
           <w:lang w:val="en-US" w:eastAsia="ru-RU"/>
         </w:rPr>
-        <w:t xml:space="preserve">    </w:t>
-      </w:r>
-      <w:r>
-        <w:rPr>
-          <w:rFonts w:ascii="Times New Roman" w:eastAsia="Times New Roman" w:hAnsi="Times New Roman" w:cs="Times New Roman"/>
-          <w:color w:val="000088"/>
-          <w:sz w:val="28"/>
-          <w:szCs w:val="28"/>
-          <w:shd w:val="clear" w:color="auto" w:fill="F3F4F6"/>
-          <w:lang w:val="en-US" w:eastAsia="ru-RU"/>
-        </w:rPr>
-        <w:t>return</w:t>
-      </w:r>
-      <w:r>
-        <w:rPr>
-          <w:rFonts w:ascii="Times New Roman" w:eastAsia="Times New Roman" w:hAnsi="Times New Roman" w:cs="Times New Roman"/>
-          <w:color w:val="000000"/>
-          <w:sz w:val="28"/>
-          <w:szCs w:val="28"/>
-          <w:shd w:val="clear" w:color="auto" w:fill="F3F4F6"/>
-          <w:lang w:val="en-US" w:eastAsia="ru-RU"/>
-        </w:rPr>
-        <w:t xml:space="preserve"> </w:t>
-      </w:r>
-      <w:r>
-        <w:rPr>
-          <w:rFonts w:ascii="Times New Roman" w:eastAsia="Times New Roman" w:hAnsi="Times New Roman" w:cs="Times New Roman"/>
-          <w:color w:val="006666"/>
-          <w:sz w:val="28"/>
-          <w:szCs w:val="28"/>
-          <w:shd w:val="clear" w:color="auto" w:fill="F3F4F6"/>
-          <w:lang w:val="en-US" w:eastAsia="ru-RU"/>
-        </w:rPr>
-        <w:t>0</w:t>
-      </w:r>
-      <w:r>
-        <w:rPr>
-          <w:rFonts w:ascii="Times New Roman" w:eastAsia="Times New Roman" w:hAnsi="Times New Roman" w:cs="Times New Roman"/>
-          <w:color w:val="000000"/>
-          <w:sz w:val="28"/>
-          <w:szCs w:val="28"/>
-          <w:shd w:val="clear" w:color="auto" w:fill="F3F4F6"/>
-          <w:lang w:val="en-US" w:eastAsia="ru-RU"/>
-        </w:rPr>
-        <w:t>;</w:t>
-      </w:r>
-    </w:p>
-    <w:p>
-      <w:pPr>
-        <w:shd w:val="clear" w:color="auto" w:fill="FFFFFF"/>
+        <w:t>            count++;</w:t>
+      </w:r>
+    </w:p>
+    <w:p>
+      <w:pPr>
         <w:tabs>
           <w:tab w:val="left" w:pos="916"/>
           <w:tab w:val="left" w:pos="1832"/>
@@ -6811,25 +6057,494 @@
           <w:tab w:val="left" w:pos="13740"/>
           <w:tab w:val="left" w:pos="14656"/>
         </w:tabs>
-        <w:spacing w:before="240" w:after="240" w:line="240" w:lineRule="auto"/>
-        <w:rPr>
-          <w:rFonts w:ascii="Times New Roman" w:eastAsia="Times New Roman" w:hAnsi="Times New Roman" w:cs="Times New Roman"/>
-          <w:color w:val="222222"/>
-          <w:sz w:val="28"/>
-          <w:szCs w:val="28"/>
-          <w:lang w:eastAsia="ru-RU"/>
-        </w:rPr>
-      </w:pPr>
-      <w:r>
-        <w:rPr>
-          <w:rFonts w:ascii="Times New Roman" w:eastAsia="Times New Roman" w:hAnsi="Times New Roman" w:cs="Times New Roman"/>
-          <w:color w:val="000000"/>
-          <w:sz w:val="28"/>
-          <w:szCs w:val="28"/>
-          <w:shd w:val="clear" w:color="auto" w:fill="F3F4F6"/>
+        <w:spacing w:after="0" w:line="240" w:lineRule="auto"/>
+        <w:rPr>
+          <w:rFonts w:ascii="Times New Roman" w:eastAsia="Times New Roman" w:hAnsi="Times New Roman" w:cs="Times New Roman"/>
+          <w:sz w:val="28"/>
+          <w:szCs w:val="28"/>
+          <w:lang w:eastAsia="ru-RU"/>
+        </w:rPr>
+      </w:pPr>
+      <w:r>
+        <w:rPr>
+          <w:rFonts w:ascii="Times New Roman" w:eastAsia="Times New Roman" w:hAnsi="Times New Roman" w:cs="Times New Roman"/>
+          <w:sz w:val="28"/>
+          <w:szCs w:val="28"/>
+          <w:lang w:val="en-US" w:eastAsia="ru-RU"/>
+        </w:rPr>
+        <w:t xml:space="preserve">        </w:t>
+      </w:r>
+      <w:r>
+        <w:rPr>
+          <w:rFonts w:ascii="Times New Roman" w:eastAsia="Times New Roman" w:hAnsi="Times New Roman" w:cs="Times New Roman"/>
+          <w:sz w:val="28"/>
+          <w:szCs w:val="28"/>
           <w:lang w:eastAsia="ru-RU"/>
         </w:rPr>
         <w:t>}</w:t>
+      </w:r>
+    </w:p>
+    <w:p>
+      <w:pPr>
+        <w:tabs>
+          <w:tab w:val="left" w:pos="916"/>
+          <w:tab w:val="left" w:pos="1832"/>
+          <w:tab w:val="left" w:pos="2748"/>
+          <w:tab w:val="left" w:pos="3664"/>
+          <w:tab w:val="left" w:pos="4580"/>
+          <w:tab w:val="left" w:pos="5496"/>
+          <w:tab w:val="left" w:pos="6412"/>
+          <w:tab w:val="left" w:pos="7328"/>
+          <w:tab w:val="left" w:pos="8244"/>
+          <w:tab w:val="left" w:pos="9160"/>
+          <w:tab w:val="left" w:pos="10076"/>
+          <w:tab w:val="left" w:pos="10992"/>
+          <w:tab w:val="left" w:pos="11908"/>
+          <w:tab w:val="left" w:pos="12824"/>
+          <w:tab w:val="left" w:pos="13740"/>
+          <w:tab w:val="left" w:pos="14656"/>
+        </w:tabs>
+        <w:spacing w:after="0" w:line="240" w:lineRule="auto"/>
+        <w:rPr>
+          <w:rFonts w:ascii="Times New Roman" w:eastAsia="Times New Roman" w:hAnsi="Times New Roman" w:cs="Times New Roman"/>
+          <w:sz w:val="28"/>
+          <w:szCs w:val="28"/>
+          <w:lang w:eastAsia="ru-RU"/>
+        </w:rPr>
+      </w:pPr>
+      <w:r>
+        <w:rPr>
+          <w:rFonts w:ascii="Times New Roman" w:eastAsia="Times New Roman" w:hAnsi="Times New Roman" w:cs="Times New Roman"/>
+          <w:sz w:val="28"/>
+          <w:szCs w:val="28"/>
+          <w:lang w:eastAsia="ru-RU"/>
+        </w:rPr>
+        <w:t>    }</w:t>
+      </w:r>
+    </w:p>
+    <w:p>
+      <w:pPr>
+        <w:tabs>
+          <w:tab w:val="left" w:pos="916"/>
+          <w:tab w:val="left" w:pos="1832"/>
+          <w:tab w:val="left" w:pos="2748"/>
+          <w:tab w:val="left" w:pos="3664"/>
+          <w:tab w:val="left" w:pos="4580"/>
+          <w:tab w:val="left" w:pos="5496"/>
+          <w:tab w:val="left" w:pos="6412"/>
+          <w:tab w:val="left" w:pos="7328"/>
+          <w:tab w:val="left" w:pos="8244"/>
+          <w:tab w:val="left" w:pos="9160"/>
+          <w:tab w:val="left" w:pos="10076"/>
+          <w:tab w:val="left" w:pos="10992"/>
+          <w:tab w:val="left" w:pos="11908"/>
+          <w:tab w:val="left" w:pos="12824"/>
+          <w:tab w:val="left" w:pos="13740"/>
+          <w:tab w:val="left" w:pos="14656"/>
+        </w:tabs>
+        <w:spacing w:after="0" w:line="240" w:lineRule="auto"/>
+        <w:rPr>
+          <w:rFonts w:ascii="Times New Roman" w:eastAsia="Times New Roman" w:hAnsi="Times New Roman" w:cs="Times New Roman"/>
+          <w:sz w:val="28"/>
+          <w:szCs w:val="28"/>
+          <w:lang w:eastAsia="ru-RU"/>
+        </w:rPr>
+      </w:pPr>
+    </w:p>
+    <w:p>
+      <w:pPr>
+        <w:tabs>
+          <w:tab w:val="left" w:pos="916"/>
+          <w:tab w:val="left" w:pos="1832"/>
+          <w:tab w:val="left" w:pos="2748"/>
+          <w:tab w:val="left" w:pos="3664"/>
+          <w:tab w:val="left" w:pos="4580"/>
+          <w:tab w:val="left" w:pos="5496"/>
+          <w:tab w:val="left" w:pos="6412"/>
+          <w:tab w:val="left" w:pos="7328"/>
+          <w:tab w:val="left" w:pos="8244"/>
+          <w:tab w:val="left" w:pos="9160"/>
+          <w:tab w:val="left" w:pos="10076"/>
+          <w:tab w:val="left" w:pos="10992"/>
+          <w:tab w:val="left" w:pos="11908"/>
+          <w:tab w:val="left" w:pos="12824"/>
+          <w:tab w:val="left" w:pos="13740"/>
+          <w:tab w:val="left" w:pos="14656"/>
+        </w:tabs>
+        <w:spacing w:after="0" w:line="240" w:lineRule="auto"/>
+        <w:rPr>
+          <w:rFonts w:ascii="Times New Roman" w:eastAsia="Times New Roman" w:hAnsi="Times New Roman" w:cs="Times New Roman"/>
+          <w:sz w:val="28"/>
+          <w:szCs w:val="28"/>
+          <w:lang w:eastAsia="ru-RU"/>
+        </w:rPr>
+      </w:pPr>
+      <w:r>
+        <w:rPr>
+          <w:rFonts w:ascii="Times New Roman" w:eastAsia="Times New Roman" w:hAnsi="Times New Roman" w:cs="Times New Roman"/>
+          <w:sz w:val="28"/>
+          <w:szCs w:val="28"/>
+          <w:lang w:eastAsia="ru-RU"/>
+        </w:rPr>
+        <w:lastRenderedPageBreak/>
+        <w:t>    cout &lt;&lt; count &lt;&lt; endl;</w:t>
+      </w:r>
+    </w:p>
+    <w:p>
+      <w:pPr>
+        <w:tabs>
+          <w:tab w:val="left" w:pos="916"/>
+          <w:tab w:val="left" w:pos="1832"/>
+          <w:tab w:val="left" w:pos="2748"/>
+          <w:tab w:val="left" w:pos="3664"/>
+          <w:tab w:val="left" w:pos="4580"/>
+          <w:tab w:val="left" w:pos="5496"/>
+          <w:tab w:val="left" w:pos="6412"/>
+          <w:tab w:val="left" w:pos="7328"/>
+          <w:tab w:val="left" w:pos="8244"/>
+          <w:tab w:val="left" w:pos="9160"/>
+          <w:tab w:val="left" w:pos="10076"/>
+          <w:tab w:val="left" w:pos="10992"/>
+          <w:tab w:val="left" w:pos="11908"/>
+          <w:tab w:val="left" w:pos="12824"/>
+          <w:tab w:val="left" w:pos="13740"/>
+          <w:tab w:val="left" w:pos="14656"/>
+        </w:tabs>
+        <w:spacing w:after="0" w:line="240" w:lineRule="auto"/>
+        <w:rPr>
+          <w:rFonts w:ascii="Times New Roman" w:eastAsia="Times New Roman" w:hAnsi="Times New Roman" w:cs="Times New Roman"/>
+          <w:sz w:val="28"/>
+          <w:szCs w:val="28"/>
+          <w:lang w:eastAsia="ru-RU"/>
+        </w:rPr>
+      </w:pPr>
+      <w:r>
+        <w:rPr>
+          <w:rFonts w:ascii="Times New Roman" w:eastAsia="Times New Roman" w:hAnsi="Times New Roman" w:cs="Times New Roman"/>
+          <w:sz w:val="28"/>
+          <w:szCs w:val="28"/>
+          <w:lang w:eastAsia="ru-RU"/>
+        </w:rPr>
+        <w:t>    return 0;</w:t>
+      </w:r>
+    </w:p>
+    <w:p>
+      <w:pPr>
+        <w:tabs>
+          <w:tab w:val="left" w:pos="916"/>
+          <w:tab w:val="left" w:pos="1832"/>
+          <w:tab w:val="left" w:pos="2748"/>
+          <w:tab w:val="left" w:pos="3664"/>
+          <w:tab w:val="left" w:pos="4580"/>
+          <w:tab w:val="left" w:pos="5496"/>
+          <w:tab w:val="left" w:pos="6412"/>
+          <w:tab w:val="left" w:pos="7328"/>
+          <w:tab w:val="left" w:pos="8244"/>
+          <w:tab w:val="left" w:pos="9160"/>
+          <w:tab w:val="left" w:pos="10076"/>
+          <w:tab w:val="left" w:pos="10992"/>
+          <w:tab w:val="left" w:pos="11908"/>
+          <w:tab w:val="left" w:pos="12824"/>
+          <w:tab w:val="left" w:pos="13740"/>
+          <w:tab w:val="left" w:pos="14656"/>
+        </w:tabs>
+        <w:spacing w:after="0" w:line="240" w:lineRule="auto"/>
+        <w:rPr>
+          <w:rFonts w:ascii="Times New Roman" w:eastAsia="Times New Roman" w:hAnsi="Times New Roman" w:cs="Times New Roman"/>
+          <w:sz w:val="28"/>
+          <w:szCs w:val="28"/>
+          <w:lang w:eastAsia="ru-RU"/>
+        </w:rPr>
+      </w:pPr>
+      <w:r>
+        <w:rPr>
+          <w:rFonts w:ascii="Times New Roman" w:eastAsia="Times New Roman" w:hAnsi="Times New Roman" w:cs="Times New Roman"/>
+          <w:sz w:val="28"/>
+          <w:szCs w:val="28"/>
+          <w:lang w:eastAsia="ru-RU"/>
+        </w:rPr>
+        <w:t>}</w:t>
+      </w:r>
+    </w:p>
+    <w:p>
+      <w:pPr>
+        <w:spacing w:after="0" w:line="240" w:lineRule="auto"/>
+        <w:rPr>
+          <w:rFonts w:ascii="Times New Roman" w:eastAsia="Times New Roman" w:hAnsi="Times New Roman" w:cs="Times New Roman"/>
+          <w:sz w:val="28"/>
+          <w:szCs w:val="28"/>
+          <w:lang w:eastAsia="ru-RU"/>
+        </w:rPr>
+      </w:pPr>
+      <w:r>
+        <w:rPr>
+          <w:rFonts w:ascii="Times New Roman" w:eastAsia="Times New Roman" w:hAnsi="Times New Roman" w:cs="Times New Roman"/>
+          <w:noProof/>
+          <w:sz w:val="28"/>
+          <w:szCs w:val="28"/>
+          <w:lang w:eastAsia="ru-RU"/>
+        </w:rPr>
+        <mc:AlternateContent>
+          <mc:Choice Requires="wps">
+            <w:drawing>
+              <wp:inline distT="0" distB="0" distL="0" distR="0">
+                <wp:extent cx="304800" cy="304800"/>
+                <wp:effectExtent l="0" t="0" r="0" b="0"/>
+                <wp:docPr id="2" name="Прямоугольник 2" descr="data:image/gif;base64,R0lGODlhAQABAPABAP///wAAACH5BAEKAAAALAAAAAABAAEAAAICRAEAOw=="/>
+                <wp:cNvGraphicFramePr>
+                  <a:graphicFrameLocks xmlns:a="http://schemas.openxmlformats.org/drawingml/2006/main" noChangeAspect="1"/>
+                </wp:cNvGraphicFramePr>
+                <a:graphic xmlns:a="http://schemas.openxmlformats.org/drawingml/2006/main">
+                  <a:graphicData uri="http://schemas.microsoft.com/office/word/2010/wordprocessingShape">
+                    <wps:wsp>
+                      <wps:cNvSpPr>
+                        <a:spLocks noChangeAspect="1" noChangeArrowheads="1"/>
+                      </wps:cNvSpPr>
+                      <wps:spPr bwMode="auto">
+                        <a:xfrm>
+                          <a:off x="0" y="0"/>
+                          <a:ext cx="304800" cy="304800"/>
+                        </a:xfrm>
+                        <a:prstGeom prst="rect">
+                          <a:avLst/>
+                        </a:prstGeom>
+                        <a:noFill/>
+                        <a:ln>
+                          <a:noFill/>
+                        </a:ln>
+                        <a:extLst>
+                          <a:ext uri="{909E8E84-426E-40DD-AFC4-6F175D3DCCD1}">
+                            <a14:hiddenFill xmlns:a14="http://schemas.microsoft.com/office/drawing/2010/main">
+                              <a:solidFill>
+                                <a:srgbClr val="FFFFFF"/>
+                              </a:solidFill>
+                            </a14:hiddenFill>
+                          </a:ext>
+                          <a:ext uri="{91240B29-F687-4F45-9708-019B960494DF}">
+                            <a14:hiddenLine xmlns:a14="http://schemas.microsoft.com/office/drawing/2010/main" w="9525">
+                              <a:solidFill>
+                                <a:srgbClr val="000000"/>
+                              </a:solidFill>
+                              <a:miter lim="800000"/>
+                              <a:headEnd/>
+                              <a:tailEnd/>
+                            </a14:hiddenLine>
+                          </a:ext>
+                        </a:extLst>
+                      </wps:spPr>
+                      <wps:bodyPr rot="0" vert="horz" wrap="square" lIns="91440" tIns="45720" rIns="91440" bIns="45720" anchor="t" anchorCtr="0" upright="1">
+                        <a:noAutofit/>
+                      </wps:bodyPr>
+                    </wps:wsp>
+                  </a:graphicData>
+                </a:graphic>
+              </wp:inline>
+            </w:drawing>
+          </mc:Choice>
+          <mc:Fallback>
+            <w:pict>
+              <v:rect w14:anchorId="3A5FD0F5" id="Прямоугольник 2" o:spid="_x0000_s1026" alt="data:image/gif;base64,R0lGODlhAQABAPABAP///wAAACH5BAEKAAAALAAAAAABAAEAAAICRAEAOw==" style="width:24pt;height:24pt;visibility:visible;mso-wrap-style:square;mso-left-percent:-10001;mso-top-percent:-10001;mso-position-horizontal:absolute;mso-position-horizontal-relative:char;mso-position-vertical:absolute;mso-position-vertical-relative:line;mso-left-percent:-10001;mso-top-percent:-10001;v-text-anchor:top" o:gfxdata="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" filled="f" stroked="f">
+                <o:lock v:ext="edit" aspectratio="t"/>
+                <w10:anchorlock/>
+              </v:rect>
+            </w:pict>
+          </mc:Fallback>
+        </mc:AlternateContent>
+      </w:r>
+      <w:r>
+        <w:rPr>
+          <w:rFonts w:ascii="Times New Roman" w:eastAsia="Times New Roman" w:hAnsi="Times New Roman" w:cs="Times New Roman"/>
+          <w:noProof/>
+          <w:sz w:val="28"/>
+          <w:szCs w:val="28"/>
+          <w:lang w:eastAsia="ru-RU"/>
+        </w:rPr>
+        <mc:AlternateContent>
+          <mc:Choice Requires="wps">
+            <w:drawing>
+              <wp:inline distT="0" distB="0" distL="0" distR="0">
+                <wp:extent cx="144780" cy="144780"/>
+                <wp:effectExtent l="0" t="0" r="0" b="0"/>
+                <wp:docPr id="1" name="Прямоугольник 1" descr="data:image/gif;base64,R0lGODlhAQABAPABAP///wAAACH5BAEKAAAALAAAAAABAAEAAAICRAEAOw=="/>
+                <wp:cNvGraphicFramePr>
+                  <a:graphicFrameLocks xmlns:a="http://schemas.openxmlformats.org/drawingml/2006/main" noChangeAspect="1"/>
+                </wp:cNvGraphicFramePr>
+                <a:graphic xmlns:a="http://schemas.openxmlformats.org/drawingml/2006/main">
+                  <a:graphicData uri="http://schemas.microsoft.com/office/word/2010/wordprocessingShape">
+                    <wps:wsp>
+                      <wps:cNvSpPr>
+                        <a:spLocks noChangeAspect="1" noChangeArrowheads="1"/>
+                      </wps:cNvSpPr>
+                      <wps:spPr bwMode="auto">
+                        <a:xfrm>
+                          <a:off x="0" y="0"/>
+                          <a:ext cx="144780" cy="144780"/>
+                        </a:xfrm>
+                        <a:prstGeom prst="rect">
+                          <a:avLst/>
+                        </a:prstGeom>
+                        <a:noFill/>
+                        <a:ln>
+                          <a:noFill/>
+                        </a:ln>
+                        <a:extLst>
+                          <a:ext uri="{909E8E84-426E-40DD-AFC4-6F175D3DCCD1}">
+                            <a14:hiddenFill xmlns:a14="http://schemas.microsoft.com/office/drawing/2010/main">
+                              <a:solidFill>
+                                <a:srgbClr val="FFFFFF"/>
+                              </a:solidFill>
+                            </a14:hiddenFill>
+                          </a:ext>
+                          <a:ext uri="{91240B29-F687-4F45-9708-019B960494DF}">
+                            <a14:hiddenLine xmlns:a14="http://schemas.microsoft.com/office/drawing/2010/main" w="9525">
+                              <a:solidFill>
+                                <a:srgbClr val="000000"/>
+                              </a:solidFill>
+                              <a:miter lim="800000"/>
+                              <a:headEnd/>
+                              <a:tailEnd/>
+                            </a14:hiddenLine>
+                          </a:ext>
+                        </a:extLst>
+                      </wps:spPr>
+                      <wps:bodyPr rot="0" vert="horz" wrap="square" lIns="91440" tIns="45720" rIns="91440" bIns="45720" anchor="t" anchorCtr="0" upright="1">
+                        <a:noAutofit/>
+                      </wps:bodyPr>
+                    </wps:wsp>
+                  </a:graphicData>
+                </a:graphic>
+              </wp:inline>
+            </w:drawing>
+          </mc:Choice>
+          <mc:Fallback>
+            <w:pict>
+              <v:rect w14:anchorId="1E3195A5" id="Прямоугольник 1" o:spid="_x0000_s1026" alt="data:image/gif;base64,R0lGODlhAQABAPABAP///wAAACH5BAEKAAAALAAAAAABAAEAAAICRAEAOw==" style="width:11.4pt;height:11.4pt;visibility:visible;mso-wrap-style:square;mso-left-percent:-10001;mso-top-percent:-10001;mso-position-horizontal:absolute;mso-position-horizontal-relative:char;mso-position-vertical:absolute;mso-position-vertical-relative:line;mso-left-percent:-10001;mso-top-percent:-10001;v-text-anchor:top" o:gfxdata="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" filled="f" stroked="f">
+                <o:lock v:ext="edit" aspectratio="t"/>
+                <w10:anchorlock/>
+              </v:rect>
+            </w:pict>
+          </mc:Fallback>
+        </mc:AlternateContent>
+      </w:r>
+    </w:p>
+    <w:p>
+      <w:pPr>
+        <w:spacing w:before="100" w:beforeAutospacing="1" w:after="100" w:afterAutospacing="1" w:line="240" w:lineRule="auto"/>
+        <w:rPr>
+          <w:rFonts w:ascii="Times New Roman" w:eastAsia="Times New Roman" w:hAnsi="Times New Roman" w:cs="Times New Roman"/>
+          <w:sz w:val="28"/>
+          <w:szCs w:val="28"/>
+          <w:lang w:eastAsia="ru-RU"/>
+        </w:rPr>
+      </w:pPr>
+      <w:r>
+        <w:rPr>
+          <w:rFonts w:ascii="Times New Roman" w:eastAsia="Times New Roman" w:hAnsi="Times New Roman" w:cs="Times New Roman"/>
+          <w:sz w:val="28"/>
+          <w:szCs w:val="28"/>
+          <w:lang w:eastAsia="ru-RU"/>
+        </w:rPr>
+        <w:t>Результат программы: 2, так как два элемента (40 и 50) больше числа 35.</w:t>
+      </w:r>
+    </w:p>
+    <w:p>
+      <w:pPr>
+        <w:spacing w:before="100" w:beforeAutospacing="1" w:after="100" w:afterAutospacing="1" w:line="240" w:lineRule="auto"/>
+        <w:rPr>
+          <w:rFonts w:ascii="Times New Roman" w:eastAsia="Times New Roman" w:hAnsi="Times New Roman" w:cs="Times New Roman"/>
+          <w:sz w:val="28"/>
+          <w:szCs w:val="28"/>
+          <w:lang w:eastAsia="ru-RU"/>
+        </w:rPr>
+      </w:pPr>
+      <w:r>
+        <w:rPr>
+          <w:rFonts w:ascii="Times New Roman" w:eastAsia="Times New Roman" w:hAnsi="Times New Roman" w:cs="Times New Roman"/>
+          <w:sz w:val="28"/>
+          <w:szCs w:val="28"/>
+          <w:lang w:eastAsia="ru-RU"/>
+        </w:rPr>
+        <w:t>Ответ: 2.</w:t>
+      </w:r>
+    </w:p>
+    <w:p>
+      <w:pPr>
+        <w:spacing w:before="100" w:beforeAutospacing="1" w:after="100" w:afterAutospacing="1" w:line="240" w:lineRule="auto"/>
+        <w:rPr>
+          <w:rFonts w:ascii="Times New Roman" w:eastAsia="Times New Roman" w:hAnsi="Times New Roman" w:cs="Times New Roman"/>
+          <w:sz w:val="28"/>
+          <w:szCs w:val="28"/>
+          <w:lang w:eastAsia="ru-RU"/>
+        </w:rPr>
+      </w:pPr>
+      <w:r>
+        <w:rPr>
+          <w:rFonts w:ascii="Times New Roman" w:eastAsia="Times New Roman" w:hAnsi="Times New Roman" w:cs="Times New Roman"/>
+          <w:sz w:val="28"/>
+          <w:szCs w:val="28"/>
+          <w:lang w:eastAsia="ru-RU"/>
+        </w:rPr>
+        <w:t xml:space="preserve">Использование </w:t>
+      </w:r>
+      <w:r>
+        <w:rPr>
+          <w:rFonts w:ascii="Times New Roman" w:eastAsia="Times New Roman" w:hAnsi="Times New Roman" w:cs="Times New Roman"/>
+          <w:b/>
+          <w:bCs/>
+          <w:sz w:val="28"/>
+          <w:szCs w:val="28"/>
+          <w:lang w:eastAsia="ru-RU"/>
+        </w:rPr>
+        <w:t>C++</w:t>
+      </w:r>
+      <w:r>
+        <w:rPr>
+          <w:rFonts w:ascii="Times New Roman" w:eastAsia="Times New Roman" w:hAnsi="Times New Roman" w:cs="Times New Roman"/>
+          <w:sz w:val="28"/>
+          <w:szCs w:val="28"/>
+          <w:lang w:eastAsia="ru-RU"/>
+        </w:rPr>
+        <w:t xml:space="preserve"> для сдачи </w:t>
+      </w:r>
+      <w:r>
+        <w:rPr>
+          <w:rFonts w:ascii="Times New Roman" w:eastAsia="Times New Roman" w:hAnsi="Times New Roman" w:cs="Times New Roman"/>
+          <w:b/>
+          <w:bCs/>
+          <w:sz w:val="28"/>
+          <w:szCs w:val="28"/>
+          <w:lang w:eastAsia="ru-RU"/>
+        </w:rPr>
+        <w:t>ОГЭ</w:t>
+      </w:r>
+      <w:r>
+        <w:rPr>
+          <w:rFonts w:ascii="Times New Roman" w:eastAsia="Times New Roman" w:hAnsi="Times New Roman" w:cs="Times New Roman"/>
+          <w:sz w:val="28"/>
+          <w:szCs w:val="28"/>
+          <w:lang w:eastAsia="ru-RU"/>
+        </w:rPr>
+        <w:t xml:space="preserve"> по информатике позволяет развить строгую алгоритмическую дисциплину, научиться грамотно структурировать код и лучше понять принципы работы программ. Хотя </w:t>
+      </w:r>
+      <w:r>
+        <w:rPr>
+          <w:rFonts w:ascii="Times New Roman" w:eastAsia="Times New Roman" w:hAnsi="Times New Roman" w:cs="Times New Roman"/>
+          <w:b/>
+          <w:bCs/>
+          <w:sz w:val="28"/>
+          <w:szCs w:val="28"/>
+          <w:lang w:eastAsia="ru-RU"/>
+        </w:rPr>
+        <w:t>C++</w:t>
+      </w:r>
+      <w:r>
+        <w:rPr>
+          <w:rFonts w:ascii="Times New Roman" w:eastAsia="Times New Roman" w:hAnsi="Times New Roman" w:cs="Times New Roman"/>
+          <w:sz w:val="28"/>
+          <w:szCs w:val="28"/>
+          <w:lang w:eastAsia="ru-RU"/>
+        </w:rPr>
+        <w:t xml:space="preserve"> сложнее в освоении, он предоставляет мощные инструменты для решения задач любой сложности и открывает двери в мир инженерного и системного программирования.</w:t>
       </w:r>
     </w:p>
     <w:p>
@@ -6847,157 +6562,12 @@
       <w:r>
         <w:rPr>
           <w:rFonts w:ascii="Times New Roman" w:eastAsia="Times New Roman" w:hAnsi="Times New Roman" w:cs="Times New Roman"/>
-          <w:color w:val="222222"/>
-          <w:sz w:val="28"/>
-          <w:szCs w:val="28"/>
-          <w:lang w:eastAsia="ru-RU"/>
-        </w:rPr>
-        <w:t>Результат программы: 2, так как два элемента (40 и 50) больше числа 35.</w:t>
-      </w:r>
-    </w:p>
-    <w:p>
-      <w:pPr>
-        <w:shd w:val="clear" w:color="auto" w:fill="FFFFFF"/>
-        <w:spacing w:before="240" w:after="240" w:line="240" w:lineRule="auto"/>
-        <w:rPr>
-          <w:rFonts w:ascii="Times New Roman" w:eastAsia="Times New Roman" w:hAnsi="Times New Roman" w:cs="Times New Roman"/>
-          <w:b/>
-          <w:color w:val="222222"/>
-          <w:sz w:val="28"/>
-          <w:szCs w:val="28"/>
-          <w:lang w:eastAsia="ru-RU"/>
-        </w:rPr>
-      </w:pPr>
-      <w:r>
-        <w:rPr>
-          <w:rFonts w:ascii="Times New Roman" w:eastAsia="Times New Roman" w:hAnsi="Times New Roman" w:cs="Times New Roman"/>
-          <w:b/>
-          <w:color w:val="222222"/>
-          <w:sz w:val="28"/>
-          <w:szCs w:val="28"/>
-          <w:lang w:eastAsia="ru-RU"/>
-        </w:rPr>
-        <w:t>Ответ: 2.</w:t>
-      </w:r>
-    </w:p>
-    <w:p>
-      <w:pPr>
-        <w:shd w:val="clear" w:color="auto" w:fill="FFFFFF"/>
-        <w:spacing w:before="240" w:after="240" w:line="240" w:lineRule="auto"/>
-        <w:rPr>
-          <w:rFonts w:ascii="Times New Roman" w:eastAsia="Times New Roman" w:hAnsi="Times New Roman" w:cs="Times New Roman"/>
-          <w:b/>
-          <w:color w:val="222222"/>
-          <w:sz w:val="28"/>
-          <w:szCs w:val="28"/>
-          <w:lang w:eastAsia="ru-RU"/>
-        </w:rPr>
-      </w:pPr>
-      <w:bookmarkStart w:id="0" w:name="_GoBack"/>
-      <w:bookmarkEnd w:id="0"/>
-    </w:p>
-    <w:p>
-      <w:pPr>
-        <w:shd w:val="clear" w:color="auto" w:fill="FFFFFF"/>
-        <w:spacing w:before="240" w:after="240" w:line="240" w:lineRule="auto"/>
-        <w:ind w:firstLine="708"/>
-        <w:rPr>
-          <w:rFonts w:ascii="Times New Roman" w:eastAsia="Times New Roman" w:hAnsi="Times New Roman" w:cs="Times New Roman"/>
-          <w:color w:val="222222"/>
-          <w:sz w:val="28"/>
-          <w:szCs w:val="28"/>
-          <w:lang w:eastAsia="ru-RU"/>
-        </w:rPr>
-      </w:pPr>
-      <w:r>
-        <w:rPr>
-          <w:rFonts w:ascii="Times New Roman" w:eastAsia="Times New Roman" w:hAnsi="Times New Roman" w:cs="Times New Roman"/>
-          <w:color w:val="222222"/>
-          <w:sz w:val="28"/>
-          <w:szCs w:val="28"/>
-          <w:lang w:eastAsia="ru-RU"/>
-        </w:rPr>
-        <w:t>Использование </w:t>
-      </w:r>
-      <w:r>
-        <w:rPr>
-          <w:rFonts w:ascii="Times New Roman" w:eastAsia="Times New Roman" w:hAnsi="Times New Roman" w:cs="Times New Roman"/>
-          <w:b/>
-          <w:bCs/>
-          <w:color w:val="222222"/>
-          <w:sz w:val="28"/>
-          <w:szCs w:val="28"/>
-          <w:lang w:eastAsia="ru-RU"/>
-        </w:rPr>
-        <w:t>C++</w:t>
-      </w:r>
-      <w:r>
-        <w:rPr>
-          <w:rFonts w:ascii="Times New Roman" w:eastAsia="Times New Roman" w:hAnsi="Times New Roman" w:cs="Times New Roman"/>
-          <w:color w:val="222222"/>
-          <w:sz w:val="28"/>
-          <w:szCs w:val="28"/>
-          <w:lang w:eastAsia="ru-RU"/>
-        </w:rPr>
-        <w:t> для сдачи </w:t>
-      </w:r>
-      <w:r>
-        <w:rPr>
-          <w:rFonts w:ascii="Times New Roman" w:eastAsia="Times New Roman" w:hAnsi="Times New Roman" w:cs="Times New Roman"/>
-          <w:b/>
-          <w:bCs/>
-          <w:color w:val="222222"/>
-          <w:sz w:val="28"/>
-          <w:szCs w:val="28"/>
-          <w:lang w:eastAsia="ru-RU"/>
-        </w:rPr>
-        <w:t>ОГЭ</w:t>
-      </w:r>
-      <w:r>
-        <w:rPr>
-          <w:rFonts w:ascii="Times New Roman" w:eastAsia="Times New Roman" w:hAnsi="Times New Roman" w:cs="Times New Roman"/>
-          <w:color w:val="222222"/>
-          <w:sz w:val="28"/>
-          <w:szCs w:val="28"/>
-          <w:lang w:eastAsia="ru-RU"/>
-        </w:rPr>
-        <w:t> по информатике позволяет развить строгую алгоритмическую дисциплину, научиться грамотно структурировать код и лучше понять принципы работы программ. Хотя </w:t>
-      </w:r>
-      <w:r>
-        <w:rPr>
-          <w:rFonts w:ascii="Times New Roman" w:eastAsia="Times New Roman" w:hAnsi="Times New Roman" w:cs="Times New Roman"/>
-          <w:b/>
-          <w:bCs/>
-          <w:color w:val="222222"/>
-          <w:sz w:val="28"/>
-          <w:szCs w:val="28"/>
-          <w:lang w:eastAsia="ru-RU"/>
-        </w:rPr>
-        <w:t>C++</w:t>
-      </w:r>
-      <w:r>
-        <w:rPr>
-          <w:rFonts w:ascii="Times New Roman" w:eastAsia="Times New Roman" w:hAnsi="Times New Roman" w:cs="Times New Roman"/>
-          <w:color w:val="222222"/>
-          <w:sz w:val="28"/>
-          <w:szCs w:val="28"/>
-          <w:lang w:eastAsia="ru-RU"/>
-        </w:rPr>
-        <w:t> сложнее в освоении, он предоставляет мощные инструменты для решения задач любой сложности и открывает двери в мир инженерного и системного программирования.</w:t>
-      </w:r>
-    </w:p>
-    <w:p>
-      <w:pPr>
-        <w:shd w:val="clear" w:color="auto" w:fill="FFFFFF"/>
-        <w:spacing w:before="240" w:after="240" w:line="240" w:lineRule="auto"/>
-        <w:rPr>
-          <w:rFonts w:ascii="Times New Roman" w:eastAsia="Times New Roman" w:hAnsi="Times New Roman" w:cs="Times New Roman"/>
-          <w:color w:val="222222"/>
-          <w:sz w:val="28"/>
-          <w:szCs w:val="28"/>
-          <w:lang w:eastAsia="ru-RU"/>
-        </w:rPr>
-      </w:pPr>
+          <w:sz w:val="24"/>
+          <w:szCs w:val="24"/>
+          <w:lang w:eastAsia="ru-RU"/>
+        </w:rPr>
+        <w:t>​</w:t>
+      </w:r>
     </w:p>
     <w:p>
       <w:pPr>
@@ -7748,6 +7318,25 @@
     <w:basedOn w:val="a0"/>
     <w:rsid w:val="00544C39"/>
   </w:style>
+  <w:style w:type="character" w:customStyle="1" w:styleId="ckeimageresizer">
+    <w:name w:val="cke_image_resizer"/>
+    <w:basedOn w:val="a0"/>
+    <w:rsid w:val="00973715"/>
+  </w:style>
+  <w:style w:type="paragraph" w:customStyle="1" w:styleId="ckewidgetelement">
+    <w:name w:val="cke_widget_element"/>
+    <w:basedOn w:val="a"/>
+    <w:rsid w:val="00973715"/>
+    <w:pPr>
+      <w:spacing w:before="100" w:beforeAutospacing="1" w:after="100" w:afterAutospacing="1" w:line="240" w:lineRule="auto"/>
+    </w:pPr>
+    <w:rPr>
+      <w:rFonts w:ascii="Times New Roman" w:eastAsia="Times New Roman" w:hAnsi="Times New Roman" w:cs="Times New Roman"/>
+      <w:sz w:val="24"/>
+      <w:szCs w:val="24"/>
+      <w:lang w:eastAsia="ru-RU"/>
+    </w:rPr>
+  </w:style>
 </w:styles>
 </file>
 
@@ -8017,7 +7606,7 @@
 </file>
 
 <file path=customXml/itemProps1.xml><?xml version="1.0" encoding="utf-8"?>
-<ds:datastoreItem xmlns:ds="http://schemas.openxmlformats.org/officeDocument/2006/customXml" ds:itemID="{06180FEF-222F-4431-B1EE-1F74A9DC7048}">
+<ds:datastoreItem xmlns:ds="http://schemas.openxmlformats.org/officeDocument/2006/customXml" ds:itemID="{20C70791-D904-4D54-BA30-2418A0815D79}">
   <ds:schemaRefs>
     <ds:schemaRef ds:uri="http://schemas.openxmlformats.org/officeDocument/2006/bibliography"/>
   </ds:schemaRefs>

</xml_diff>